<commit_message>
Adding NodeJS With Validation Error Message Handling Using I18N
</commit_message>
<xml_diff>
--- a/Nodejs/Express-Validator-With-Handling-Validation-Messages/Express-Validator-With-Handling-Validation-Messages-Notes-01.docx
+++ b/Nodejs/Express-Validator-With-Handling-Validation-Messages/Express-Validator-With-Handling-Validation-Messages-Notes-01.docx
@@ -2459,7 +2459,7 @@
         <w:shd w:val="clear" w:color="auto" w:fill="FFFFFF"/>
         <w:spacing w:after="0" w:line="285" w:lineRule="atLeast"/>
         <w:rPr>
-          <w:rFonts w:ascii="Sakkal Majalla" w:eastAsia="Times New Roman" w:hAnsi="Sakkal Majalla" w:cs="Sakkal Majalla" w:hint="cs"/>
+          <w:rFonts w:ascii="Sakkal Majalla" w:eastAsia="Times New Roman" w:hAnsi="Sakkal Majalla" w:cs="Sakkal Majalla"/>
           <w:color w:val="202020"/>
           <w:kern w:val="0"/>
           <w14:ligatures w14:val="none"/>
@@ -7636,7 +7636,7 @@
         <w:shd w:val="clear" w:color="auto" w:fill="FFFFFF"/>
         <w:spacing w:after="0" w:line="285" w:lineRule="atLeast"/>
         <w:rPr>
-          <w:rFonts w:ascii="Sakkal Majalla" w:eastAsia="Times New Roman" w:hAnsi="Sakkal Majalla" w:cs="Sakkal Majalla" w:hint="cs"/>
+          <w:rFonts w:ascii="Sakkal Majalla" w:eastAsia="Times New Roman" w:hAnsi="Sakkal Majalla" w:cs="Sakkal Majalla"/>
           <w:color w:val="202020"/>
           <w:kern w:val="0"/>
           <w14:ligatures w14:val="none"/>
@@ -11842,7 +11842,3115 @@
         <w:shd w:val="clear" w:color="auto" w:fill="FFFFFF"/>
         <w:spacing w:after="0" w:line="285" w:lineRule="atLeast"/>
         <w:rPr>
-          <w:rFonts w:ascii="Sakkal Majalla" w:eastAsia="Times New Roman" w:hAnsi="Sakkal Majalla" w:cs="Sakkal Majalla" w:hint="cs"/>
+          <w:rFonts w:ascii="Sakkal Majalla" w:eastAsia="Times New Roman" w:hAnsi="Sakkal Majalla" w:cs="Sakkal Majalla"/>
+          <w:color w:val="202020"/>
+          <w:kern w:val="0"/>
+          <w14:ligatures w14:val="none"/>
+        </w:rPr>
+      </w:pPr>
+      <w:r>
+        <w:rPr>
+          <w:rFonts w:ascii="Sakkal Majalla" w:eastAsia="Times New Roman" w:hAnsi="Sakkal Majalla" w:cs="Sakkal Majalla"/>
+          <w:color w:val="202020"/>
+          <w:kern w:val="0"/>
+          <w14:ligatures w14:val="none"/>
+        </w:rPr>
+        <w:t>Create the register router:</w:t>
+      </w:r>
+    </w:p>
+    <w:p>
+      <w:pPr>
+        <w:shd w:val="clear" w:color="auto" w:fill="FFFFFF"/>
+        <w:spacing w:after="0" w:line="285" w:lineRule="atLeast"/>
+        <w:rPr>
+          <w:rFonts w:ascii="Consolas" w:eastAsia="Times New Roman" w:hAnsi="Consolas" w:cs="Times New Roman"/>
+          <w:color w:val="202020"/>
+          <w:kern w:val="0"/>
+          <w:sz w:val="21"/>
+          <w:szCs w:val="21"/>
+          <w14:ligatures w14:val="none"/>
+        </w:rPr>
+      </w:pPr>
+      <w:r>
+        <w:rPr>
+          <w:rFonts w:ascii="Consolas" w:eastAsia="Times New Roman" w:hAnsi="Consolas" w:cs="Times New Roman"/>
+          <w:color w:val="CF222E"/>
+          <w:kern w:val="0"/>
+          <w:sz w:val="21"/>
+          <w:szCs w:val="21"/>
+          <w14:ligatures w14:val="none"/>
+        </w:rPr>
+        <w:t>const</w:t>
+      </w:r>
+      <w:r>
+        <w:rPr>
+          <w:rFonts w:ascii="Consolas" w:eastAsia="Times New Roman" w:hAnsi="Consolas" w:cs="Times New Roman"/>
+          <w:color w:val="202020"/>
+          <w:kern w:val="0"/>
+          <w:sz w:val="21"/>
+          <w:szCs w:val="21"/>
+          <w14:ligatures w14:val="none"/>
+        </w:rPr>
+        <w:t xml:space="preserve"> </w:t>
+      </w:r>
+      <w:r>
+        <w:rPr>
+          <w:rFonts w:ascii="Consolas" w:eastAsia="Times New Roman" w:hAnsi="Consolas" w:cs="Times New Roman"/>
+          <w:color w:val="0550AE"/>
+          <w:kern w:val="0"/>
+          <w:sz w:val="21"/>
+          <w:szCs w:val="21"/>
+          <w14:ligatures w14:val="none"/>
+        </w:rPr>
+        <w:t>router</w:t>
+      </w:r>
+      <w:r>
+        <w:rPr>
+          <w:rFonts w:ascii="Consolas" w:eastAsia="Times New Roman" w:hAnsi="Consolas" w:cs="Times New Roman"/>
+          <w:color w:val="202020"/>
+          <w:kern w:val="0"/>
+          <w:sz w:val="21"/>
+          <w:szCs w:val="21"/>
+          <w14:ligatures w14:val="none"/>
+        </w:rPr>
+        <w:t xml:space="preserve"> </w:t>
+      </w:r>
+      <w:r>
+        <w:rPr>
+          <w:rFonts w:ascii="Consolas" w:eastAsia="Times New Roman" w:hAnsi="Consolas" w:cs="Times New Roman"/>
+          <w:color w:val="000000"/>
+          <w:kern w:val="0"/>
+          <w:sz w:val="21"/>
+          <w:szCs w:val="21"/>
+          <w14:ligatures w14:val="none"/>
+        </w:rPr>
+        <w:t>=</w:t>
+      </w:r>
+      <w:r>
+        <w:rPr>
+          <w:rFonts w:ascii="Consolas" w:eastAsia="Times New Roman" w:hAnsi="Consolas" w:cs="Times New Roman"/>
+          <w:color w:val="202020"/>
+          <w:kern w:val="0"/>
+          <w:sz w:val="21"/>
+          <w:szCs w:val="21"/>
+          <w14:ligatures w14:val="none"/>
+        </w:rPr>
+        <w:t xml:space="preserve"> </w:t>
+      </w:r>
+      <w:r>
+        <w:rPr>
+          <w:rFonts w:ascii="Consolas" w:eastAsia="Times New Roman" w:hAnsi="Consolas" w:cs="Times New Roman"/>
+          <w:color w:val="8250DF"/>
+          <w:kern w:val="0"/>
+          <w:sz w:val="21"/>
+          <w:szCs w:val="21"/>
+          <w14:ligatures w14:val="none"/>
+        </w:rPr>
+        <w:t>require</w:t>
+      </w:r>
+      <w:r>
+        <w:rPr>
+          <w:rFonts w:ascii="Consolas" w:eastAsia="Times New Roman" w:hAnsi="Consolas" w:cs="Times New Roman"/>
+          <w:color w:val="202020"/>
+          <w:kern w:val="0"/>
+          <w:sz w:val="21"/>
+          <w:szCs w:val="21"/>
+          <w14:ligatures w14:val="none"/>
+        </w:rPr>
+        <w:t>(</w:t>
+      </w:r>
+      <w:r>
+        <w:rPr>
+          <w:rFonts w:ascii="Consolas" w:eastAsia="Times New Roman" w:hAnsi="Consolas" w:cs="Times New Roman"/>
+          <w:color w:val="0A3069"/>
+          <w:kern w:val="0"/>
+          <w:sz w:val="21"/>
+          <w:szCs w:val="21"/>
+          <w14:ligatures w14:val="none"/>
+        </w:rPr>
+        <w:t>'express'</w:t>
+      </w:r>
+      <w:r>
+        <w:rPr>
+          <w:rFonts w:ascii="Consolas" w:eastAsia="Times New Roman" w:hAnsi="Consolas" w:cs="Times New Roman"/>
+          <w:color w:val="202020"/>
+          <w:kern w:val="0"/>
+          <w:sz w:val="21"/>
+          <w:szCs w:val="21"/>
+          <w14:ligatures w14:val="none"/>
+        </w:rPr>
+        <w:t>).</w:t>
+      </w:r>
+      <w:r>
+        <w:rPr>
+          <w:rFonts w:ascii="Consolas" w:eastAsia="Times New Roman" w:hAnsi="Consolas" w:cs="Times New Roman"/>
+          <w:color w:val="8250DF"/>
+          <w:kern w:val="0"/>
+          <w:sz w:val="21"/>
+          <w:szCs w:val="21"/>
+          <w14:ligatures w14:val="none"/>
+        </w:rPr>
+        <w:t>Router</w:t>
+      </w:r>
+      <w:r>
+        <w:rPr>
+          <w:rFonts w:ascii="Consolas" w:eastAsia="Times New Roman" w:hAnsi="Consolas" w:cs="Times New Roman"/>
+          <w:color w:val="202020"/>
+          <w:kern w:val="0"/>
+          <w:sz w:val="21"/>
+          <w:szCs w:val="21"/>
+          <w14:ligatures w14:val="none"/>
+        </w:rPr>
+        <w:t>()</w:t>
+      </w:r>
+    </w:p>
+    <w:p>
+      <w:pPr>
+        <w:shd w:val="clear" w:color="auto" w:fill="FFFFFF"/>
+        <w:spacing w:after="0" w:line="285" w:lineRule="atLeast"/>
+        <w:rPr>
+          <w:rFonts w:ascii="Consolas" w:eastAsia="Times New Roman" w:hAnsi="Consolas" w:cs="Times New Roman"/>
+          <w:color w:val="202020"/>
+          <w:kern w:val="0"/>
+          <w:sz w:val="21"/>
+          <w:szCs w:val="21"/>
+          <w14:ligatures w14:val="none"/>
+        </w:rPr>
+      </w:pPr>
+    </w:p>
+    <w:p>
+      <w:pPr>
+        <w:shd w:val="clear" w:color="auto" w:fill="FFFFFF"/>
+        <w:spacing w:after="0" w:line="285" w:lineRule="atLeast"/>
+        <w:rPr>
+          <w:rFonts w:ascii="Consolas" w:eastAsia="Times New Roman" w:hAnsi="Consolas" w:cs="Times New Roman"/>
+          <w:color w:val="202020"/>
+          <w:kern w:val="0"/>
+          <w:sz w:val="21"/>
+          <w:szCs w:val="21"/>
+          <w14:ligatures w14:val="none"/>
+        </w:rPr>
+      </w:pPr>
+      <w:r>
+        <w:rPr>
+          <w:rFonts w:ascii="Consolas" w:eastAsia="Times New Roman" w:hAnsi="Consolas" w:cs="Times New Roman"/>
+          <w:color w:val="6E7781"/>
+          <w:kern w:val="0"/>
+          <w:sz w:val="21"/>
+          <w:szCs w:val="21"/>
+          <w14:ligatures w14:val="none"/>
+        </w:rPr>
+        <w:t>// Registration route</w:t>
+      </w:r>
+    </w:p>
+    <w:p>
+      <w:pPr>
+        <w:shd w:val="clear" w:color="auto" w:fill="FFFFFF"/>
+        <w:spacing w:after="0" w:line="285" w:lineRule="atLeast"/>
+        <w:rPr>
+          <w:rFonts w:ascii="Consolas" w:eastAsia="Times New Roman" w:hAnsi="Consolas" w:cs="Times New Roman"/>
+          <w:color w:val="202020"/>
+          <w:kern w:val="0"/>
+          <w:sz w:val="21"/>
+          <w:szCs w:val="21"/>
+          <w14:ligatures w14:val="none"/>
+        </w:rPr>
+      </w:pPr>
+      <w:r>
+        <w:rPr>
+          <w:rFonts w:ascii="Consolas" w:eastAsia="Times New Roman" w:hAnsi="Consolas" w:cs="Times New Roman"/>
+          <w:color w:val="0550AE"/>
+          <w:kern w:val="0"/>
+          <w:sz w:val="21"/>
+          <w:szCs w:val="21"/>
+          <w14:ligatures w14:val="none"/>
+        </w:rPr>
+        <w:t>router</w:t>
+      </w:r>
+      <w:r>
+        <w:rPr>
+          <w:rFonts w:ascii="Consolas" w:eastAsia="Times New Roman" w:hAnsi="Consolas" w:cs="Times New Roman"/>
+          <w:color w:val="202020"/>
+          <w:kern w:val="0"/>
+          <w:sz w:val="21"/>
+          <w:szCs w:val="21"/>
+          <w14:ligatures w14:val="none"/>
+        </w:rPr>
+        <w:t>.</w:t>
+      </w:r>
+      <w:r>
+        <w:rPr>
+          <w:rFonts w:ascii="Consolas" w:eastAsia="Times New Roman" w:hAnsi="Consolas" w:cs="Times New Roman"/>
+          <w:color w:val="8250DF"/>
+          <w:kern w:val="0"/>
+          <w:sz w:val="21"/>
+          <w:szCs w:val="21"/>
+          <w14:ligatures w14:val="none"/>
+        </w:rPr>
+        <w:t>post</w:t>
+      </w:r>
+      <w:r>
+        <w:rPr>
+          <w:rFonts w:ascii="Consolas" w:eastAsia="Times New Roman" w:hAnsi="Consolas" w:cs="Times New Roman"/>
+          <w:color w:val="202020"/>
+          <w:kern w:val="0"/>
+          <w:sz w:val="21"/>
+          <w:szCs w:val="21"/>
+          <w14:ligatures w14:val="none"/>
+        </w:rPr>
+        <w:t>(</w:t>
+      </w:r>
+      <w:r>
+        <w:rPr>
+          <w:rFonts w:ascii="Consolas" w:eastAsia="Times New Roman" w:hAnsi="Consolas" w:cs="Times New Roman"/>
+          <w:color w:val="0A3069"/>
+          <w:kern w:val="0"/>
+          <w:sz w:val="21"/>
+          <w:szCs w:val="21"/>
+          <w14:ligatures w14:val="none"/>
+        </w:rPr>
+        <w:t>'/api/register'</w:t>
+      </w:r>
+      <w:r>
+        <w:rPr>
+          <w:rFonts w:ascii="Consolas" w:eastAsia="Times New Roman" w:hAnsi="Consolas" w:cs="Times New Roman"/>
+          <w:color w:val="202020"/>
+          <w:kern w:val="0"/>
+          <w:sz w:val="21"/>
+          <w:szCs w:val="21"/>
+          <w14:ligatures w14:val="none"/>
+        </w:rPr>
+        <w:t xml:space="preserve">, </w:t>
+      </w:r>
+    </w:p>
+    <w:p>
+      <w:pPr>
+        <w:shd w:val="clear" w:color="auto" w:fill="FFFFFF"/>
+        <w:spacing w:after="0" w:line="285" w:lineRule="atLeast"/>
+        <w:rPr>
+          <w:rFonts w:ascii="Consolas" w:eastAsia="Times New Roman" w:hAnsi="Consolas" w:cs="Times New Roman"/>
+          <w:color w:val="202020"/>
+          <w:kern w:val="0"/>
+          <w:sz w:val="21"/>
+          <w:szCs w:val="21"/>
+          <w14:ligatures w14:val="none"/>
+        </w:rPr>
+      </w:pPr>
+      <w:r>
+        <w:rPr>
+          <w:rFonts w:ascii="Consolas" w:eastAsia="Times New Roman" w:hAnsi="Consolas" w:cs="Times New Roman"/>
+          <w:color w:val="202020"/>
+          <w:kern w:val="0"/>
+          <w:sz w:val="21"/>
+          <w:szCs w:val="21"/>
+          <w14:ligatures w14:val="none"/>
+        </w:rPr>
+        <w:t>  (</w:t>
+      </w:r>
+      <w:r>
+        <w:rPr>
+          <w:rFonts w:ascii="Consolas" w:eastAsia="Times New Roman" w:hAnsi="Consolas" w:cs="Times New Roman"/>
+          <w:color w:val="953800"/>
+          <w:kern w:val="0"/>
+          <w:sz w:val="21"/>
+          <w:szCs w:val="21"/>
+          <w14:ligatures w14:val="none"/>
+        </w:rPr>
+        <w:t>req</w:t>
+      </w:r>
+      <w:r>
+        <w:rPr>
+          <w:rFonts w:ascii="Consolas" w:eastAsia="Times New Roman" w:hAnsi="Consolas" w:cs="Times New Roman"/>
+          <w:color w:val="202020"/>
+          <w:kern w:val="0"/>
+          <w:sz w:val="21"/>
+          <w:szCs w:val="21"/>
+          <w14:ligatures w14:val="none"/>
+        </w:rPr>
+        <w:t xml:space="preserve">, </w:t>
+      </w:r>
+      <w:r>
+        <w:rPr>
+          <w:rFonts w:ascii="Consolas" w:eastAsia="Times New Roman" w:hAnsi="Consolas" w:cs="Times New Roman"/>
+          <w:color w:val="953800"/>
+          <w:kern w:val="0"/>
+          <w:sz w:val="21"/>
+          <w:szCs w:val="21"/>
+          <w14:ligatures w14:val="none"/>
+        </w:rPr>
+        <w:t>res</w:t>
+      </w:r>
+      <w:r>
+        <w:rPr>
+          <w:rFonts w:ascii="Consolas" w:eastAsia="Times New Roman" w:hAnsi="Consolas" w:cs="Times New Roman"/>
+          <w:color w:val="202020"/>
+          <w:kern w:val="0"/>
+          <w:sz w:val="21"/>
+          <w:szCs w:val="21"/>
+          <w14:ligatures w14:val="none"/>
+        </w:rPr>
+        <w:t xml:space="preserve">) </w:t>
+      </w:r>
+      <w:r>
+        <w:rPr>
+          <w:rFonts w:ascii="Consolas" w:eastAsia="Times New Roman" w:hAnsi="Consolas" w:cs="Times New Roman"/>
+          <w:color w:val="CF222E"/>
+          <w:kern w:val="0"/>
+          <w:sz w:val="21"/>
+          <w:szCs w:val="21"/>
+          <w14:ligatures w14:val="none"/>
+        </w:rPr>
+        <w:t>=&gt;</w:t>
+      </w:r>
+      <w:r>
+        <w:rPr>
+          <w:rFonts w:ascii="Consolas" w:eastAsia="Times New Roman" w:hAnsi="Consolas" w:cs="Times New Roman"/>
+          <w:color w:val="202020"/>
+          <w:kern w:val="0"/>
+          <w:sz w:val="21"/>
+          <w:szCs w:val="21"/>
+          <w14:ligatures w14:val="none"/>
+        </w:rPr>
+        <w:t xml:space="preserve"> </w:t>
+      </w:r>
+      <w:r>
+        <w:rPr>
+          <w:rFonts w:ascii="Consolas" w:eastAsia="Times New Roman" w:hAnsi="Consolas" w:cs="Times New Roman"/>
+          <w:color w:val="1F2328"/>
+          <w:kern w:val="0"/>
+          <w:sz w:val="21"/>
+          <w:szCs w:val="21"/>
+          <w14:ligatures w14:val="none"/>
+        </w:rPr>
+        <w:t>{</w:t>
+      </w:r>
+    </w:p>
+    <w:p>
+      <w:pPr>
+        <w:shd w:val="clear" w:color="auto" w:fill="FFFFFF"/>
+        <w:spacing w:after="0" w:line="285" w:lineRule="atLeast"/>
+        <w:rPr>
+          <w:rFonts w:ascii="Consolas" w:eastAsia="Times New Roman" w:hAnsi="Consolas" w:cs="Times New Roman"/>
+          <w:color w:val="202020"/>
+          <w:kern w:val="0"/>
+          <w:sz w:val="21"/>
+          <w:szCs w:val="21"/>
+          <w14:ligatures w14:val="none"/>
+        </w:rPr>
+      </w:pPr>
+      <w:r>
+        <w:rPr>
+          <w:rFonts w:ascii="Consolas" w:eastAsia="Times New Roman" w:hAnsi="Consolas" w:cs="Times New Roman"/>
+          <w:color w:val="1F2328"/>
+          <w:kern w:val="0"/>
+          <w:sz w:val="21"/>
+          <w:szCs w:val="21"/>
+          <w14:ligatures w14:val="none"/>
+        </w:rPr>
+        <w:t xml:space="preserve">    </w:t>
+      </w:r>
+      <w:r>
+        <w:rPr>
+          <w:rFonts w:ascii="Consolas" w:eastAsia="Times New Roman" w:hAnsi="Consolas" w:cs="Times New Roman"/>
+          <w:color w:val="953800"/>
+          <w:kern w:val="0"/>
+          <w:sz w:val="21"/>
+          <w:szCs w:val="21"/>
+          <w14:ligatures w14:val="none"/>
+        </w:rPr>
+        <w:t>res</w:t>
+      </w:r>
+      <w:r>
+        <w:rPr>
+          <w:rFonts w:ascii="Consolas" w:eastAsia="Times New Roman" w:hAnsi="Consolas" w:cs="Times New Roman"/>
+          <w:color w:val="1F2328"/>
+          <w:kern w:val="0"/>
+          <w:sz w:val="21"/>
+          <w:szCs w:val="21"/>
+          <w14:ligatures w14:val="none"/>
+        </w:rPr>
+        <w:t>.</w:t>
+      </w:r>
+      <w:r>
+        <w:rPr>
+          <w:rFonts w:ascii="Consolas" w:eastAsia="Times New Roman" w:hAnsi="Consolas" w:cs="Times New Roman"/>
+          <w:color w:val="8250DF"/>
+          <w:kern w:val="0"/>
+          <w:sz w:val="21"/>
+          <w:szCs w:val="21"/>
+          <w14:ligatures w14:val="none"/>
+        </w:rPr>
+        <w:t>json</w:t>
+      </w:r>
+      <w:r>
+        <w:rPr>
+          <w:rFonts w:ascii="Consolas" w:eastAsia="Times New Roman" w:hAnsi="Consolas" w:cs="Times New Roman"/>
+          <w:color w:val="1F2328"/>
+          <w:kern w:val="0"/>
+          <w:sz w:val="21"/>
+          <w:szCs w:val="21"/>
+          <w14:ligatures w14:val="none"/>
+        </w:rPr>
+        <w:t>({</w:t>
+      </w:r>
+    </w:p>
+    <w:p>
+      <w:pPr>
+        <w:shd w:val="clear" w:color="auto" w:fill="FFFFFF"/>
+        <w:spacing w:after="0" w:line="285" w:lineRule="atLeast"/>
+        <w:rPr>
+          <w:rFonts w:ascii="Consolas" w:eastAsia="Times New Roman" w:hAnsi="Consolas" w:cs="Times New Roman"/>
+          <w:color w:val="202020"/>
+          <w:kern w:val="0"/>
+          <w:sz w:val="21"/>
+          <w:szCs w:val="21"/>
+          <w14:ligatures w14:val="none"/>
+        </w:rPr>
+      </w:pPr>
+      <w:r>
+        <w:rPr>
+          <w:rFonts w:ascii="Consolas" w:eastAsia="Times New Roman" w:hAnsi="Consolas" w:cs="Times New Roman"/>
+          <w:color w:val="1F2328"/>
+          <w:kern w:val="0"/>
+          <w:sz w:val="21"/>
+          <w:szCs w:val="21"/>
+          <w14:ligatures w14:val="none"/>
+        </w:rPr>
+        <w:t>      success</w:t>
+      </w:r>
+      <w:r>
+        <w:rPr>
+          <w:rFonts w:ascii="Consolas" w:eastAsia="Times New Roman" w:hAnsi="Consolas" w:cs="Times New Roman"/>
+          <w:color w:val="001080"/>
+          <w:kern w:val="0"/>
+          <w:sz w:val="21"/>
+          <w:szCs w:val="21"/>
+          <w14:ligatures w14:val="none"/>
+        </w:rPr>
+        <w:t>:</w:t>
+      </w:r>
+      <w:r>
+        <w:rPr>
+          <w:rFonts w:ascii="Consolas" w:eastAsia="Times New Roman" w:hAnsi="Consolas" w:cs="Times New Roman"/>
+          <w:color w:val="1F2328"/>
+          <w:kern w:val="0"/>
+          <w:sz w:val="21"/>
+          <w:szCs w:val="21"/>
+          <w14:ligatures w14:val="none"/>
+        </w:rPr>
+        <w:t xml:space="preserve"> </w:t>
+      </w:r>
+      <w:r>
+        <w:rPr>
+          <w:rFonts w:ascii="Consolas" w:eastAsia="Times New Roman" w:hAnsi="Consolas" w:cs="Times New Roman"/>
+          <w:color w:val="0000FF"/>
+          <w:kern w:val="0"/>
+          <w:sz w:val="21"/>
+          <w:szCs w:val="21"/>
+          <w14:ligatures w14:val="none"/>
+        </w:rPr>
+        <w:t>true</w:t>
+      </w:r>
+      <w:r>
+        <w:rPr>
+          <w:rFonts w:ascii="Consolas" w:eastAsia="Times New Roman" w:hAnsi="Consolas" w:cs="Times New Roman"/>
+          <w:color w:val="1F2328"/>
+          <w:kern w:val="0"/>
+          <w:sz w:val="21"/>
+          <w:szCs w:val="21"/>
+          <w14:ligatures w14:val="none"/>
+        </w:rPr>
+        <w:t>,</w:t>
+      </w:r>
+    </w:p>
+    <w:p>
+      <w:pPr>
+        <w:shd w:val="clear" w:color="auto" w:fill="FFFFFF"/>
+        <w:spacing w:after="0" w:line="285" w:lineRule="atLeast"/>
+        <w:rPr>
+          <w:rFonts w:ascii="Consolas" w:eastAsia="Times New Roman" w:hAnsi="Consolas" w:cs="Times New Roman"/>
+          <w:color w:val="202020"/>
+          <w:kern w:val="0"/>
+          <w:sz w:val="21"/>
+          <w:szCs w:val="21"/>
+          <w14:ligatures w14:val="none"/>
+        </w:rPr>
+      </w:pPr>
+      <w:r>
+        <w:rPr>
+          <w:rFonts w:ascii="Consolas" w:eastAsia="Times New Roman" w:hAnsi="Consolas" w:cs="Times New Roman"/>
+          <w:color w:val="1F2328"/>
+          <w:kern w:val="0"/>
+          <w:sz w:val="21"/>
+          <w:szCs w:val="21"/>
+          <w14:ligatures w14:val="none"/>
+        </w:rPr>
+        <w:t>      message</w:t>
+      </w:r>
+      <w:r>
+        <w:rPr>
+          <w:rFonts w:ascii="Consolas" w:eastAsia="Times New Roman" w:hAnsi="Consolas" w:cs="Times New Roman"/>
+          <w:color w:val="001080"/>
+          <w:kern w:val="0"/>
+          <w:sz w:val="21"/>
+          <w:szCs w:val="21"/>
+          <w14:ligatures w14:val="none"/>
+        </w:rPr>
+        <w:t>:</w:t>
+      </w:r>
+      <w:r>
+        <w:rPr>
+          <w:rFonts w:ascii="Consolas" w:eastAsia="Times New Roman" w:hAnsi="Consolas" w:cs="Times New Roman"/>
+          <w:color w:val="1F2328"/>
+          <w:kern w:val="0"/>
+          <w:sz w:val="21"/>
+          <w:szCs w:val="21"/>
+          <w14:ligatures w14:val="none"/>
+        </w:rPr>
+        <w:t xml:space="preserve"> </w:t>
+      </w:r>
+      <w:r>
+        <w:rPr>
+          <w:rFonts w:ascii="Consolas" w:eastAsia="Times New Roman" w:hAnsi="Consolas" w:cs="Times New Roman"/>
+          <w:color w:val="953800"/>
+          <w:kern w:val="0"/>
+          <w:sz w:val="21"/>
+          <w:szCs w:val="21"/>
+          <w14:ligatures w14:val="none"/>
+        </w:rPr>
+        <w:t>req</w:t>
+      </w:r>
+      <w:r>
+        <w:rPr>
+          <w:rFonts w:ascii="Consolas" w:eastAsia="Times New Roman" w:hAnsi="Consolas" w:cs="Times New Roman"/>
+          <w:color w:val="1F2328"/>
+          <w:kern w:val="0"/>
+          <w:sz w:val="21"/>
+          <w:szCs w:val="21"/>
+          <w14:ligatures w14:val="none"/>
+        </w:rPr>
+        <w:t>.</w:t>
+      </w:r>
+      <w:r>
+        <w:rPr>
+          <w:rFonts w:ascii="Consolas" w:eastAsia="Times New Roman" w:hAnsi="Consolas" w:cs="Times New Roman"/>
+          <w:color w:val="8250DF"/>
+          <w:kern w:val="0"/>
+          <w:sz w:val="21"/>
+          <w:szCs w:val="21"/>
+          <w14:ligatures w14:val="none"/>
+        </w:rPr>
+        <w:t>__</w:t>
+      </w:r>
+      <w:r>
+        <w:rPr>
+          <w:rFonts w:ascii="Consolas" w:eastAsia="Times New Roman" w:hAnsi="Consolas" w:cs="Times New Roman"/>
+          <w:color w:val="1F2328"/>
+          <w:kern w:val="0"/>
+          <w:sz w:val="21"/>
+          <w:szCs w:val="21"/>
+          <w14:ligatures w14:val="none"/>
+        </w:rPr>
+        <w:t>(</w:t>
+      </w:r>
+      <w:r>
+        <w:rPr>
+          <w:rFonts w:ascii="Consolas" w:eastAsia="Times New Roman" w:hAnsi="Consolas" w:cs="Times New Roman"/>
+          <w:color w:val="0A3069"/>
+          <w:kern w:val="0"/>
+          <w:sz w:val="21"/>
+          <w:szCs w:val="21"/>
+          <w14:ligatures w14:val="none"/>
+        </w:rPr>
+        <w:t>'Registration successful'</w:t>
+      </w:r>
+      <w:r>
+        <w:rPr>
+          <w:rFonts w:ascii="Consolas" w:eastAsia="Times New Roman" w:hAnsi="Consolas" w:cs="Times New Roman"/>
+          <w:color w:val="1F2328"/>
+          <w:kern w:val="0"/>
+          <w:sz w:val="21"/>
+          <w:szCs w:val="21"/>
+          <w14:ligatures w14:val="none"/>
+        </w:rPr>
+        <w:t>),</w:t>
+      </w:r>
+    </w:p>
+    <w:p>
+      <w:pPr>
+        <w:shd w:val="clear" w:color="auto" w:fill="FFFFFF"/>
+        <w:spacing w:after="0" w:line="285" w:lineRule="atLeast"/>
+        <w:rPr>
+          <w:rFonts w:ascii="Consolas" w:eastAsia="Times New Roman" w:hAnsi="Consolas" w:cs="Times New Roman"/>
+          <w:color w:val="202020"/>
+          <w:kern w:val="0"/>
+          <w:sz w:val="21"/>
+          <w:szCs w:val="21"/>
+          <w14:ligatures w14:val="none"/>
+        </w:rPr>
+      </w:pPr>
+      <w:r>
+        <w:rPr>
+          <w:rFonts w:ascii="Consolas" w:eastAsia="Times New Roman" w:hAnsi="Consolas" w:cs="Times New Roman"/>
+          <w:color w:val="1F2328"/>
+          <w:kern w:val="0"/>
+          <w:sz w:val="21"/>
+          <w:szCs w:val="21"/>
+          <w14:ligatures w14:val="none"/>
+        </w:rPr>
+        <w:t>      data</w:t>
+      </w:r>
+      <w:r>
+        <w:rPr>
+          <w:rFonts w:ascii="Consolas" w:eastAsia="Times New Roman" w:hAnsi="Consolas" w:cs="Times New Roman"/>
+          <w:color w:val="001080"/>
+          <w:kern w:val="0"/>
+          <w:sz w:val="21"/>
+          <w:szCs w:val="21"/>
+          <w14:ligatures w14:val="none"/>
+        </w:rPr>
+        <w:t>:</w:t>
+      </w:r>
+      <w:r>
+        <w:rPr>
+          <w:rFonts w:ascii="Consolas" w:eastAsia="Times New Roman" w:hAnsi="Consolas" w:cs="Times New Roman"/>
+          <w:color w:val="1F2328"/>
+          <w:kern w:val="0"/>
+          <w:sz w:val="21"/>
+          <w:szCs w:val="21"/>
+          <w14:ligatures w14:val="none"/>
+        </w:rPr>
+        <w:t xml:space="preserve"> {</w:t>
+      </w:r>
+    </w:p>
+    <w:p>
+      <w:pPr>
+        <w:shd w:val="clear" w:color="auto" w:fill="FFFFFF"/>
+        <w:spacing w:after="0" w:line="285" w:lineRule="atLeast"/>
+        <w:rPr>
+          <w:rFonts w:ascii="Consolas" w:eastAsia="Times New Roman" w:hAnsi="Consolas" w:cs="Times New Roman"/>
+          <w:color w:val="202020"/>
+          <w:kern w:val="0"/>
+          <w:sz w:val="21"/>
+          <w:szCs w:val="21"/>
+          <w14:ligatures w14:val="none"/>
+        </w:rPr>
+      </w:pPr>
+      <w:r>
+        <w:rPr>
+          <w:rFonts w:ascii="Consolas" w:eastAsia="Times New Roman" w:hAnsi="Consolas" w:cs="Times New Roman"/>
+          <w:color w:val="1F2328"/>
+          <w:kern w:val="0"/>
+          <w:sz w:val="21"/>
+          <w:szCs w:val="21"/>
+          <w14:ligatures w14:val="none"/>
+        </w:rPr>
+        <w:t>        username</w:t>
+      </w:r>
+      <w:r>
+        <w:rPr>
+          <w:rFonts w:ascii="Consolas" w:eastAsia="Times New Roman" w:hAnsi="Consolas" w:cs="Times New Roman"/>
+          <w:color w:val="001080"/>
+          <w:kern w:val="0"/>
+          <w:sz w:val="21"/>
+          <w:szCs w:val="21"/>
+          <w14:ligatures w14:val="none"/>
+        </w:rPr>
+        <w:t>:</w:t>
+      </w:r>
+      <w:r>
+        <w:rPr>
+          <w:rFonts w:ascii="Consolas" w:eastAsia="Times New Roman" w:hAnsi="Consolas" w:cs="Times New Roman"/>
+          <w:color w:val="1F2328"/>
+          <w:kern w:val="0"/>
+          <w:sz w:val="21"/>
+          <w:szCs w:val="21"/>
+          <w14:ligatures w14:val="none"/>
+        </w:rPr>
+        <w:t xml:space="preserve"> </w:t>
+      </w:r>
+      <w:r>
+        <w:rPr>
+          <w:rFonts w:ascii="Consolas" w:eastAsia="Times New Roman" w:hAnsi="Consolas" w:cs="Times New Roman"/>
+          <w:color w:val="953800"/>
+          <w:kern w:val="0"/>
+          <w:sz w:val="21"/>
+          <w:szCs w:val="21"/>
+          <w14:ligatures w14:val="none"/>
+        </w:rPr>
+        <w:t>req</w:t>
+      </w:r>
+      <w:r>
+        <w:rPr>
+          <w:rFonts w:ascii="Consolas" w:eastAsia="Times New Roman" w:hAnsi="Consolas" w:cs="Times New Roman"/>
+          <w:color w:val="1F2328"/>
+          <w:kern w:val="0"/>
+          <w:sz w:val="21"/>
+          <w:szCs w:val="21"/>
+          <w14:ligatures w14:val="none"/>
+        </w:rPr>
+        <w:t>.body.username,</w:t>
+      </w:r>
+    </w:p>
+    <w:p>
+      <w:pPr>
+        <w:shd w:val="clear" w:color="auto" w:fill="FFFFFF"/>
+        <w:spacing w:after="0" w:line="285" w:lineRule="atLeast"/>
+        <w:rPr>
+          <w:rFonts w:ascii="Consolas" w:eastAsia="Times New Roman" w:hAnsi="Consolas" w:cs="Times New Roman"/>
+          <w:color w:val="202020"/>
+          <w:kern w:val="0"/>
+          <w:sz w:val="21"/>
+          <w:szCs w:val="21"/>
+          <w14:ligatures w14:val="none"/>
+        </w:rPr>
+      </w:pPr>
+      <w:r>
+        <w:rPr>
+          <w:rFonts w:ascii="Consolas" w:eastAsia="Times New Roman" w:hAnsi="Consolas" w:cs="Times New Roman"/>
+          <w:color w:val="1F2328"/>
+          <w:kern w:val="0"/>
+          <w:sz w:val="21"/>
+          <w:szCs w:val="21"/>
+          <w14:ligatures w14:val="none"/>
+        </w:rPr>
+        <w:t>        email</w:t>
+      </w:r>
+      <w:r>
+        <w:rPr>
+          <w:rFonts w:ascii="Consolas" w:eastAsia="Times New Roman" w:hAnsi="Consolas" w:cs="Times New Roman"/>
+          <w:color w:val="001080"/>
+          <w:kern w:val="0"/>
+          <w:sz w:val="21"/>
+          <w:szCs w:val="21"/>
+          <w14:ligatures w14:val="none"/>
+        </w:rPr>
+        <w:t>:</w:t>
+      </w:r>
+      <w:r>
+        <w:rPr>
+          <w:rFonts w:ascii="Consolas" w:eastAsia="Times New Roman" w:hAnsi="Consolas" w:cs="Times New Roman"/>
+          <w:color w:val="1F2328"/>
+          <w:kern w:val="0"/>
+          <w:sz w:val="21"/>
+          <w:szCs w:val="21"/>
+          <w14:ligatures w14:val="none"/>
+        </w:rPr>
+        <w:t xml:space="preserve"> </w:t>
+      </w:r>
+      <w:r>
+        <w:rPr>
+          <w:rFonts w:ascii="Consolas" w:eastAsia="Times New Roman" w:hAnsi="Consolas" w:cs="Times New Roman"/>
+          <w:color w:val="953800"/>
+          <w:kern w:val="0"/>
+          <w:sz w:val="21"/>
+          <w:szCs w:val="21"/>
+          <w14:ligatures w14:val="none"/>
+        </w:rPr>
+        <w:t>req</w:t>
+      </w:r>
+      <w:r>
+        <w:rPr>
+          <w:rFonts w:ascii="Consolas" w:eastAsia="Times New Roman" w:hAnsi="Consolas" w:cs="Times New Roman"/>
+          <w:color w:val="1F2328"/>
+          <w:kern w:val="0"/>
+          <w:sz w:val="21"/>
+          <w:szCs w:val="21"/>
+          <w14:ligatures w14:val="none"/>
+        </w:rPr>
+        <w:t>.body.email</w:t>
+      </w:r>
+    </w:p>
+    <w:p>
+      <w:pPr>
+        <w:shd w:val="clear" w:color="auto" w:fill="FFFFFF"/>
+        <w:spacing w:after="0" w:line="285" w:lineRule="atLeast"/>
+        <w:rPr>
+          <w:rFonts w:ascii="Consolas" w:eastAsia="Times New Roman" w:hAnsi="Consolas" w:cs="Times New Roman"/>
+          <w:color w:val="202020"/>
+          <w:kern w:val="0"/>
+          <w:sz w:val="21"/>
+          <w:szCs w:val="21"/>
+          <w14:ligatures w14:val="none"/>
+        </w:rPr>
+      </w:pPr>
+      <w:r>
+        <w:rPr>
+          <w:rFonts w:ascii="Consolas" w:eastAsia="Times New Roman" w:hAnsi="Consolas" w:cs="Times New Roman"/>
+          <w:color w:val="1F2328"/>
+          <w:kern w:val="0"/>
+          <w:sz w:val="21"/>
+          <w:szCs w:val="21"/>
+          <w14:ligatures w14:val="none"/>
+        </w:rPr>
+        <w:t>      }</w:t>
+      </w:r>
+    </w:p>
+    <w:p>
+      <w:pPr>
+        <w:shd w:val="clear" w:color="auto" w:fill="FFFFFF"/>
+        <w:spacing w:after="0" w:line="285" w:lineRule="atLeast"/>
+        <w:rPr>
+          <w:rFonts w:ascii="Consolas" w:eastAsia="Times New Roman" w:hAnsi="Consolas" w:cs="Times New Roman"/>
+          <w:color w:val="202020"/>
+          <w:kern w:val="0"/>
+          <w:sz w:val="21"/>
+          <w:szCs w:val="21"/>
+          <w14:ligatures w14:val="none"/>
+        </w:rPr>
+      </w:pPr>
+      <w:r>
+        <w:rPr>
+          <w:rFonts w:ascii="Consolas" w:eastAsia="Times New Roman" w:hAnsi="Consolas" w:cs="Times New Roman"/>
+          <w:color w:val="1F2328"/>
+          <w:kern w:val="0"/>
+          <w:sz w:val="21"/>
+          <w:szCs w:val="21"/>
+          <w14:ligatures w14:val="none"/>
+        </w:rPr>
+        <w:t>    });</w:t>
+      </w:r>
+    </w:p>
+    <w:p>
+      <w:pPr>
+        <w:shd w:val="clear" w:color="auto" w:fill="FFFFFF"/>
+        <w:spacing w:after="0" w:line="285" w:lineRule="atLeast"/>
+        <w:rPr>
+          <w:rFonts w:ascii="Consolas" w:eastAsia="Times New Roman" w:hAnsi="Consolas" w:cs="Times New Roman"/>
+          <w:color w:val="202020"/>
+          <w:kern w:val="0"/>
+          <w:sz w:val="21"/>
+          <w:szCs w:val="21"/>
+          <w14:ligatures w14:val="none"/>
+        </w:rPr>
+      </w:pPr>
+      <w:r>
+        <w:rPr>
+          <w:rFonts w:ascii="Consolas" w:eastAsia="Times New Roman" w:hAnsi="Consolas" w:cs="Times New Roman"/>
+          <w:color w:val="1F2328"/>
+          <w:kern w:val="0"/>
+          <w:sz w:val="21"/>
+          <w:szCs w:val="21"/>
+          <w14:ligatures w14:val="none"/>
+        </w:rPr>
+        <w:t>  }</w:t>
+      </w:r>
+    </w:p>
+    <w:p>
+      <w:pPr>
+        <w:shd w:val="clear" w:color="auto" w:fill="FFFFFF"/>
+        <w:spacing w:after="0" w:line="285" w:lineRule="atLeast"/>
+        <w:rPr>
+          <w:rFonts w:ascii="Consolas" w:eastAsia="Times New Roman" w:hAnsi="Consolas" w:cs="Times New Roman"/>
+          <w:color w:val="202020"/>
+          <w:kern w:val="0"/>
+          <w:sz w:val="21"/>
+          <w:szCs w:val="21"/>
+          <w14:ligatures w14:val="none"/>
+        </w:rPr>
+      </w:pPr>
+      <w:r>
+        <w:rPr>
+          <w:rFonts w:ascii="Consolas" w:eastAsia="Times New Roman" w:hAnsi="Consolas" w:cs="Times New Roman"/>
+          <w:color w:val="202020"/>
+          <w:kern w:val="0"/>
+          <w:sz w:val="21"/>
+          <w:szCs w:val="21"/>
+          <w14:ligatures w14:val="none"/>
+        </w:rPr>
+        <w:t>);</w:t>
+      </w:r>
+    </w:p>
+    <w:p>
+      <w:pPr>
+        <w:shd w:val="clear" w:color="auto" w:fill="FFFFFF"/>
+        <w:spacing w:after="0" w:line="285" w:lineRule="atLeast"/>
+        <w:rPr>
+          <w:rFonts w:ascii="Consolas" w:eastAsia="Times New Roman" w:hAnsi="Consolas" w:cs="Times New Roman"/>
+          <w:color w:val="202020"/>
+          <w:kern w:val="0"/>
+          <w:sz w:val="21"/>
+          <w:szCs w:val="21"/>
+          <w14:ligatures w14:val="none"/>
+        </w:rPr>
+      </w:pPr>
+    </w:p>
+    <w:p>
+      <w:pPr>
+        <w:shd w:val="clear" w:color="auto" w:fill="FFFFFF"/>
+        <w:spacing w:after="0" w:line="285" w:lineRule="atLeast"/>
+        <w:rPr>
+          <w:rFonts w:ascii="Consolas" w:eastAsia="Times New Roman" w:hAnsi="Consolas" w:cs="Times New Roman"/>
+          <w:color w:val="202020"/>
+          <w:kern w:val="0"/>
+          <w:sz w:val="21"/>
+          <w:szCs w:val="21"/>
+          <w14:ligatures w14:val="none"/>
+        </w:rPr>
+      </w:pPr>
+      <w:r>
+        <w:rPr>
+          <w:rFonts w:ascii="Consolas" w:eastAsia="Times New Roman" w:hAnsi="Consolas" w:cs="Times New Roman"/>
+          <w:color w:val="0550AE"/>
+          <w:kern w:val="0"/>
+          <w:sz w:val="21"/>
+          <w:szCs w:val="21"/>
+          <w14:ligatures w14:val="none"/>
+        </w:rPr>
+        <w:t>module</w:t>
+      </w:r>
+      <w:r>
+        <w:rPr>
+          <w:rFonts w:ascii="Consolas" w:eastAsia="Times New Roman" w:hAnsi="Consolas" w:cs="Times New Roman"/>
+          <w:color w:val="202020"/>
+          <w:kern w:val="0"/>
+          <w:sz w:val="21"/>
+          <w:szCs w:val="21"/>
+          <w14:ligatures w14:val="none"/>
+        </w:rPr>
+        <w:t>.</w:t>
+      </w:r>
+      <w:r>
+        <w:rPr>
+          <w:rFonts w:ascii="Consolas" w:eastAsia="Times New Roman" w:hAnsi="Consolas" w:cs="Times New Roman"/>
+          <w:color w:val="0550AE"/>
+          <w:kern w:val="0"/>
+          <w:sz w:val="21"/>
+          <w:szCs w:val="21"/>
+          <w14:ligatures w14:val="none"/>
+        </w:rPr>
+        <w:t>exports</w:t>
+      </w:r>
+      <w:r>
+        <w:rPr>
+          <w:rFonts w:ascii="Consolas" w:eastAsia="Times New Roman" w:hAnsi="Consolas" w:cs="Times New Roman"/>
+          <w:color w:val="202020"/>
+          <w:kern w:val="0"/>
+          <w:sz w:val="21"/>
+          <w:szCs w:val="21"/>
+          <w14:ligatures w14:val="none"/>
+        </w:rPr>
+        <w:t xml:space="preserve"> </w:t>
+      </w:r>
+      <w:r>
+        <w:rPr>
+          <w:rFonts w:ascii="Consolas" w:eastAsia="Times New Roman" w:hAnsi="Consolas" w:cs="Times New Roman"/>
+          <w:color w:val="000000"/>
+          <w:kern w:val="0"/>
+          <w:sz w:val="21"/>
+          <w:szCs w:val="21"/>
+          <w14:ligatures w14:val="none"/>
+        </w:rPr>
+        <w:t>=</w:t>
+      </w:r>
+      <w:r>
+        <w:rPr>
+          <w:rFonts w:ascii="Consolas" w:eastAsia="Times New Roman" w:hAnsi="Consolas" w:cs="Times New Roman"/>
+          <w:color w:val="202020"/>
+          <w:kern w:val="0"/>
+          <w:sz w:val="21"/>
+          <w:szCs w:val="21"/>
+          <w14:ligatures w14:val="none"/>
+        </w:rPr>
+        <w:t xml:space="preserve"> </w:t>
+      </w:r>
+      <w:r>
+        <w:rPr>
+          <w:rFonts w:ascii="Consolas" w:eastAsia="Times New Roman" w:hAnsi="Consolas" w:cs="Times New Roman"/>
+          <w:color w:val="0550AE"/>
+          <w:kern w:val="0"/>
+          <w:sz w:val="21"/>
+          <w:szCs w:val="21"/>
+          <w14:ligatures w14:val="none"/>
+        </w:rPr>
+        <w:t>router</w:t>
+      </w:r>
+    </w:p>
+    <w:p>
+      <w:pPr>
+        <w:ind w:left="1440" w:firstLine="720"/>
+        <w:rPr>
+          <w:rFonts w:ascii="Sakkal Majalla" w:hAnsi="Sakkal Majalla" w:cs="Sakkal Majalla"/>
+        </w:rPr>
+      </w:pPr>
+      <w:r>
+        <w:rPr>
+          <w:rFonts w:ascii="Sakkal Majalla" w:hAnsi="Sakkal Majalla" w:cs="Sakkal Majalla"/>
+        </w:rPr>
+        <w:t>================================================</w:t>
+      </w:r>
+    </w:p>
+    <w:p>
+      <w:pPr>
+        <w:shd w:val="clear" w:color="auto" w:fill="FFFFFF"/>
+        <w:spacing w:after="0" w:line="285" w:lineRule="atLeast"/>
+        <w:rPr>
+          <w:rFonts w:ascii="Sakkal Majalla" w:eastAsia="Times New Roman" w:hAnsi="Sakkal Majalla" w:cs="Sakkal Majalla"/>
+          <w:color w:val="202020"/>
+          <w:kern w:val="0"/>
+          <w14:ligatures w14:val="none"/>
+        </w:rPr>
+      </w:pPr>
+    </w:p>
+    <w:p>
+      <w:pPr>
+        <w:shd w:val="clear" w:color="auto" w:fill="FFFFFF"/>
+        <w:spacing w:after="0" w:line="285" w:lineRule="atLeast"/>
+        <w:rPr>
+          <w:rFonts w:ascii="Sakkal Majalla" w:eastAsia="Times New Roman" w:hAnsi="Sakkal Majalla" w:cs="Sakkal Majalla"/>
+          <w:color w:val="202020"/>
+          <w:kern w:val="0"/>
+          <w14:ligatures w14:val="none"/>
+        </w:rPr>
+      </w:pPr>
+    </w:p>
+    <w:p>
+      <w:pPr>
+        <w:shd w:val="clear" w:color="auto" w:fill="FFFFFF"/>
+        <w:spacing w:after="0" w:line="285" w:lineRule="atLeast"/>
+        <w:rPr>
+          <w:rFonts w:ascii="Sakkal Majalla" w:eastAsia="Times New Roman" w:hAnsi="Sakkal Majalla" w:cs="Sakkal Majalla"/>
+          <w:color w:val="202020"/>
+          <w:kern w:val="0"/>
+          <w14:ligatures w14:val="none"/>
+        </w:rPr>
+      </w:pPr>
+      <w:r>
+        <w:rPr>
+          <w:rFonts w:ascii="Sakkal Majalla" w:eastAsia="Times New Roman" w:hAnsi="Sakkal Majalla" w:cs="Sakkal Majalla"/>
+          <w:color w:val="202020"/>
+          <w:kern w:val="0"/>
+          <w14:ligatures w14:val="none"/>
+        </w:rPr>
+        <w:lastRenderedPageBreak/>
+        <w:t>Create the login router:</w:t>
+      </w:r>
+    </w:p>
+    <w:p>
+      <w:pPr>
+        <w:shd w:val="clear" w:color="auto" w:fill="FFFFFF"/>
+        <w:spacing w:after="0" w:line="285" w:lineRule="atLeast"/>
+        <w:rPr>
+          <w:rFonts w:ascii="Consolas" w:eastAsia="Times New Roman" w:hAnsi="Consolas" w:cs="Times New Roman"/>
+          <w:color w:val="202020"/>
+          <w:kern w:val="0"/>
+          <w:sz w:val="21"/>
+          <w:szCs w:val="21"/>
+          <w14:ligatures w14:val="none"/>
+        </w:rPr>
+      </w:pPr>
+      <w:r>
+        <w:rPr>
+          <w:rFonts w:ascii="Consolas" w:eastAsia="Times New Roman" w:hAnsi="Consolas" w:cs="Times New Roman"/>
+          <w:color w:val="CF222E"/>
+          <w:kern w:val="0"/>
+          <w:sz w:val="21"/>
+          <w:szCs w:val="21"/>
+          <w14:ligatures w14:val="none"/>
+        </w:rPr>
+        <w:t>const</w:t>
+      </w:r>
+      <w:r>
+        <w:rPr>
+          <w:rFonts w:ascii="Consolas" w:eastAsia="Times New Roman" w:hAnsi="Consolas" w:cs="Times New Roman"/>
+          <w:color w:val="202020"/>
+          <w:kern w:val="0"/>
+          <w:sz w:val="21"/>
+          <w:szCs w:val="21"/>
+          <w14:ligatures w14:val="none"/>
+        </w:rPr>
+        <w:t xml:space="preserve"> </w:t>
+      </w:r>
+      <w:r>
+        <w:rPr>
+          <w:rFonts w:ascii="Consolas" w:eastAsia="Times New Roman" w:hAnsi="Consolas" w:cs="Times New Roman"/>
+          <w:color w:val="0550AE"/>
+          <w:kern w:val="0"/>
+          <w:sz w:val="21"/>
+          <w:szCs w:val="21"/>
+          <w14:ligatures w14:val="none"/>
+        </w:rPr>
+        <w:t>router</w:t>
+      </w:r>
+      <w:r>
+        <w:rPr>
+          <w:rFonts w:ascii="Consolas" w:eastAsia="Times New Roman" w:hAnsi="Consolas" w:cs="Times New Roman"/>
+          <w:color w:val="202020"/>
+          <w:kern w:val="0"/>
+          <w:sz w:val="21"/>
+          <w:szCs w:val="21"/>
+          <w14:ligatures w14:val="none"/>
+        </w:rPr>
+        <w:t xml:space="preserve"> </w:t>
+      </w:r>
+      <w:r>
+        <w:rPr>
+          <w:rFonts w:ascii="Consolas" w:eastAsia="Times New Roman" w:hAnsi="Consolas" w:cs="Times New Roman"/>
+          <w:color w:val="000000"/>
+          <w:kern w:val="0"/>
+          <w:sz w:val="21"/>
+          <w:szCs w:val="21"/>
+          <w14:ligatures w14:val="none"/>
+        </w:rPr>
+        <w:t>=</w:t>
+      </w:r>
+      <w:r>
+        <w:rPr>
+          <w:rFonts w:ascii="Consolas" w:eastAsia="Times New Roman" w:hAnsi="Consolas" w:cs="Times New Roman"/>
+          <w:color w:val="202020"/>
+          <w:kern w:val="0"/>
+          <w:sz w:val="21"/>
+          <w:szCs w:val="21"/>
+          <w14:ligatures w14:val="none"/>
+        </w:rPr>
+        <w:t xml:space="preserve"> </w:t>
+      </w:r>
+      <w:r>
+        <w:rPr>
+          <w:rFonts w:ascii="Consolas" w:eastAsia="Times New Roman" w:hAnsi="Consolas" w:cs="Times New Roman"/>
+          <w:color w:val="8250DF"/>
+          <w:kern w:val="0"/>
+          <w:sz w:val="21"/>
+          <w:szCs w:val="21"/>
+          <w14:ligatures w14:val="none"/>
+        </w:rPr>
+        <w:t>require</w:t>
+      </w:r>
+      <w:r>
+        <w:rPr>
+          <w:rFonts w:ascii="Consolas" w:eastAsia="Times New Roman" w:hAnsi="Consolas" w:cs="Times New Roman"/>
+          <w:color w:val="202020"/>
+          <w:kern w:val="0"/>
+          <w:sz w:val="21"/>
+          <w:szCs w:val="21"/>
+          <w14:ligatures w14:val="none"/>
+        </w:rPr>
+        <w:t>(</w:t>
+      </w:r>
+      <w:r>
+        <w:rPr>
+          <w:rFonts w:ascii="Consolas" w:eastAsia="Times New Roman" w:hAnsi="Consolas" w:cs="Times New Roman"/>
+          <w:color w:val="0A3069"/>
+          <w:kern w:val="0"/>
+          <w:sz w:val="21"/>
+          <w:szCs w:val="21"/>
+          <w14:ligatures w14:val="none"/>
+        </w:rPr>
+        <w:t>'express'</w:t>
+      </w:r>
+      <w:r>
+        <w:rPr>
+          <w:rFonts w:ascii="Consolas" w:eastAsia="Times New Roman" w:hAnsi="Consolas" w:cs="Times New Roman"/>
+          <w:color w:val="202020"/>
+          <w:kern w:val="0"/>
+          <w:sz w:val="21"/>
+          <w:szCs w:val="21"/>
+          <w14:ligatures w14:val="none"/>
+        </w:rPr>
+        <w:t>).</w:t>
+      </w:r>
+      <w:r>
+        <w:rPr>
+          <w:rFonts w:ascii="Consolas" w:eastAsia="Times New Roman" w:hAnsi="Consolas" w:cs="Times New Roman"/>
+          <w:color w:val="8250DF"/>
+          <w:kern w:val="0"/>
+          <w:sz w:val="21"/>
+          <w:szCs w:val="21"/>
+          <w14:ligatures w14:val="none"/>
+        </w:rPr>
+        <w:t>Router</w:t>
+      </w:r>
+      <w:r>
+        <w:rPr>
+          <w:rFonts w:ascii="Consolas" w:eastAsia="Times New Roman" w:hAnsi="Consolas" w:cs="Times New Roman"/>
+          <w:color w:val="202020"/>
+          <w:kern w:val="0"/>
+          <w:sz w:val="21"/>
+          <w:szCs w:val="21"/>
+          <w14:ligatures w14:val="none"/>
+        </w:rPr>
+        <w:t>()</w:t>
+      </w:r>
+    </w:p>
+    <w:p>
+      <w:pPr>
+        <w:shd w:val="clear" w:color="auto" w:fill="FFFFFF"/>
+        <w:spacing w:after="0" w:line="285" w:lineRule="atLeast"/>
+        <w:rPr>
+          <w:rFonts w:ascii="Consolas" w:eastAsia="Times New Roman" w:hAnsi="Consolas" w:cs="Times New Roman"/>
+          <w:color w:val="202020"/>
+          <w:kern w:val="0"/>
+          <w:sz w:val="21"/>
+          <w:szCs w:val="21"/>
+          <w14:ligatures w14:val="none"/>
+        </w:rPr>
+      </w:pPr>
+    </w:p>
+    <w:p>
+      <w:pPr>
+        <w:shd w:val="clear" w:color="auto" w:fill="FFFFFF"/>
+        <w:spacing w:after="0" w:line="285" w:lineRule="atLeast"/>
+        <w:rPr>
+          <w:rFonts w:ascii="Consolas" w:eastAsia="Times New Roman" w:hAnsi="Consolas" w:cs="Times New Roman"/>
+          <w:color w:val="202020"/>
+          <w:kern w:val="0"/>
+          <w:sz w:val="21"/>
+          <w:szCs w:val="21"/>
+          <w14:ligatures w14:val="none"/>
+        </w:rPr>
+      </w:pPr>
+      <w:r>
+        <w:rPr>
+          <w:rFonts w:ascii="Consolas" w:eastAsia="Times New Roman" w:hAnsi="Consolas" w:cs="Times New Roman"/>
+          <w:color w:val="6E7781"/>
+          <w:kern w:val="0"/>
+          <w:sz w:val="21"/>
+          <w:szCs w:val="21"/>
+          <w14:ligatures w14:val="none"/>
+        </w:rPr>
+        <w:t>// Login route</w:t>
+      </w:r>
+    </w:p>
+    <w:p>
+      <w:pPr>
+        <w:shd w:val="clear" w:color="auto" w:fill="FFFFFF"/>
+        <w:spacing w:after="0" w:line="285" w:lineRule="atLeast"/>
+        <w:rPr>
+          <w:rFonts w:ascii="Consolas" w:eastAsia="Times New Roman" w:hAnsi="Consolas" w:cs="Times New Roman"/>
+          <w:color w:val="202020"/>
+          <w:kern w:val="0"/>
+          <w:sz w:val="21"/>
+          <w:szCs w:val="21"/>
+          <w14:ligatures w14:val="none"/>
+        </w:rPr>
+      </w:pPr>
+      <w:r>
+        <w:rPr>
+          <w:rFonts w:ascii="Consolas" w:eastAsia="Times New Roman" w:hAnsi="Consolas" w:cs="Times New Roman"/>
+          <w:color w:val="0550AE"/>
+          <w:kern w:val="0"/>
+          <w:sz w:val="21"/>
+          <w:szCs w:val="21"/>
+          <w14:ligatures w14:val="none"/>
+        </w:rPr>
+        <w:t>router</w:t>
+      </w:r>
+      <w:r>
+        <w:rPr>
+          <w:rFonts w:ascii="Consolas" w:eastAsia="Times New Roman" w:hAnsi="Consolas" w:cs="Times New Roman"/>
+          <w:color w:val="202020"/>
+          <w:kern w:val="0"/>
+          <w:sz w:val="21"/>
+          <w:szCs w:val="21"/>
+          <w14:ligatures w14:val="none"/>
+        </w:rPr>
+        <w:t>.</w:t>
+      </w:r>
+      <w:r>
+        <w:rPr>
+          <w:rFonts w:ascii="Consolas" w:eastAsia="Times New Roman" w:hAnsi="Consolas" w:cs="Times New Roman"/>
+          <w:color w:val="8250DF"/>
+          <w:kern w:val="0"/>
+          <w:sz w:val="21"/>
+          <w:szCs w:val="21"/>
+          <w14:ligatures w14:val="none"/>
+        </w:rPr>
+        <w:t>post</w:t>
+      </w:r>
+      <w:r>
+        <w:rPr>
+          <w:rFonts w:ascii="Consolas" w:eastAsia="Times New Roman" w:hAnsi="Consolas" w:cs="Times New Roman"/>
+          <w:color w:val="202020"/>
+          <w:kern w:val="0"/>
+          <w:sz w:val="21"/>
+          <w:szCs w:val="21"/>
+          <w14:ligatures w14:val="none"/>
+        </w:rPr>
+        <w:t>(</w:t>
+      </w:r>
+      <w:r>
+        <w:rPr>
+          <w:rFonts w:ascii="Consolas" w:eastAsia="Times New Roman" w:hAnsi="Consolas" w:cs="Times New Roman"/>
+          <w:color w:val="0A3069"/>
+          <w:kern w:val="0"/>
+          <w:sz w:val="21"/>
+          <w:szCs w:val="21"/>
+          <w14:ligatures w14:val="none"/>
+        </w:rPr>
+        <w:t>'/api/login'</w:t>
+      </w:r>
+      <w:r>
+        <w:rPr>
+          <w:rFonts w:ascii="Consolas" w:eastAsia="Times New Roman" w:hAnsi="Consolas" w:cs="Times New Roman"/>
+          <w:color w:val="202020"/>
+          <w:kern w:val="0"/>
+          <w:sz w:val="21"/>
+          <w:szCs w:val="21"/>
+          <w14:ligatures w14:val="none"/>
+        </w:rPr>
+        <w:t>,</w:t>
+      </w:r>
+    </w:p>
+    <w:p>
+      <w:pPr>
+        <w:shd w:val="clear" w:color="auto" w:fill="FFFFFF"/>
+        <w:spacing w:after="0" w:line="285" w:lineRule="atLeast"/>
+        <w:rPr>
+          <w:rFonts w:ascii="Consolas" w:eastAsia="Times New Roman" w:hAnsi="Consolas" w:cs="Times New Roman"/>
+          <w:color w:val="202020"/>
+          <w:kern w:val="0"/>
+          <w:sz w:val="21"/>
+          <w:szCs w:val="21"/>
+          <w14:ligatures w14:val="none"/>
+        </w:rPr>
+      </w:pPr>
+      <w:r>
+        <w:rPr>
+          <w:rFonts w:ascii="Consolas" w:eastAsia="Times New Roman" w:hAnsi="Consolas" w:cs="Times New Roman"/>
+          <w:color w:val="202020"/>
+          <w:kern w:val="0"/>
+          <w:sz w:val="21"/>
+          <w:szCs w:val="21"/>
+          <w14:ligatures w14:val="none"/>
+        </w:rPr>
+        <w:t>  (</w:t>
+      </w:r>
+      <w:r>
+        <w:rPr>
+          <w:rFonts w:ascii="Consolas" w:eastAsia="Times New Roman" w:hAnsi="Consolas" w:cs="Times New Roman"/>
+          <w:color w:val="953800"/>
+          <w:kern w:val="0"/>
+          <w:sz w:val="21"/>
+          <w:szCs w:val="21"/>
+          <w14:ligatures w14:val="none"/>
+        </w:rPr>
+        <w:t>req</w:t>
+      </w:r>
+      <w:r>
+        <w:rPr>
+          <w:rFonts w:ascii="Consolas" w:eastAsia="Times New Roman" w:hAnsi="Consolas" w:cs="Times New Roman"/>
+          <w:color w:val="202020"/>
+          <w:kern w:val="0"/>
+          <w:sz w:val="21"/>
+          <w:szCs w:val="21"/>
+          <w14:ligatures w14:val="none"/>
+        </w:rPr>
+        <w:t xml:space="preserve">, </w:t>
+      </w:r>
+      <w:r>
+        <w:rPr>
+          <w:rFonts w:ascii="Consolas" w:eastAsia="Times New Roman" w:hAnsi="Consolas" w:cs="Times New Roman"/>
+          <w:color w:val="953800"/>
+          <w:kern w:val="0"/>
+          <w:sz w:val="21"/>
+          <w:szCs w:val="21"/>
+          <w14:ligatures w14:val="none"/>
+        </w:rPr>
+        <w:t>res</w:t>
+      </w:r>
+      <w:r>
+        <w:rPr>
+          <w:rFonts w:ascii="Consolas" w:eastAsia="Times New Roman" w:hAnsi="Consolas" w:cs="Times New Roman"/>
+          <w:color w:val="202020"/>
+          <w:kern w:val="0"/>
+          <w:sz w:val="21"/>
+          <w:szCs w:val="21"/>
+          <w14:ligatures w14:val="none"/>
+        </w:rPr>
+        <w:t xml:space="preserve">) </w:t>
+      </w:r>
+      <w:r>
+        <w:rPr>
+          <w:rFonts w:ascii="Consolas" w:eastAsia="Times New Roman" w:hAnsi="Consolas" w:cs="Times New Roman"/>
+          <w:color w:val="CF222E"/>
+          <w:kern w:val="0"/>
+          <w:sz w:val="21"/>
+          <w:szCs w:val="21"/>
+          <w14:ligatures w14:val="none"/>
+        </w:rPr>
+        <w:t>=&gt;</w:t>
+      </w:r>
+      <w:r>
+        <w:rPr>
+          <w:rFonts w:ascii="Consolas" w:eastAsia="Times New Roman" w:hAnsi="Consolas" w:cs="Times New Roman"/>
+          <w:color w:val="202020"/>
+          <w:kern w:val="0"/>
+          <w:sz w:val="21"/>
+          <w:szCs w:val="21"/>
+          <w14:ligatures w14:val="none"/>
+        </w:rPr>
+        <w:t xml:space="preserve"> </w:t>
+      </w:r>
+      <w:r>
+        <w:rPr>
+          <w:rFonts w:ascii="Consolas" w:eastAsia="Times New Roman" w:hAnsi="Consolas" w:cs="Times New Roman"/>
+          <w:color w:val="1F2328"/>
+          <w:kern w:val="0"/>
+          <w:sz w:val="21"/>
+          <w:szCs w:val="21"/>
+          <w14:ligatures w14:val="none"/>
+        </w:rPr>
+        <w:t>{</w:t>
+      </w:r>
+    </w:p>
+    <w:p>
+      <w:pPr>
+        <w:shd w:val="clear" w:color="auto" w:fill="FFFFFF"/>
+        <w:spacing w:after="0" w:line="285" w:lineRule="atLeast"/>
+        <w:rPr>
+          <w:rFonts w:ascii="Consolas" w:eastAsia="Times New Roman" w:hAnsi="Consolas" w:cs="Times New Roman"/>
+          <w:color w:val="202020"/>
+          <w:kern w:val="0"/>
+          <w:sz w:val="21"/>
+          <w:szCs w:val="21"/>
+          <w14:ligatures w14:val="none"/>
+        </w:rPr>
+      </w:pPr>
+      <w:r>
+        <w:rPr>
+          <w:rFonts w:ascii="Consolas" w:eastAsia="Times New Roman" w:hAnsi="Consolas" w:cs="Times New Roman"/>
+          <w:color w:val="1F2328"/>
+          <w:kern w:val="0"/>
+          <w:sz w:val="21"/>
+          <w:szCs w:val="21"/>
+          <w14:ligatures w14:val="none"/>
+        </w:rPr>
+        <w:t xml:space="preserve">    </w:t>
+      </w:r>
+      <w:r>
+        <w:rPr>
+          <w:rFonts w:ascii="Consolas" w:eastAsia="Times New Roman" w:hAnsi="Consolas" w:cs="Times New Roman"/>
+          <w:color w:val="953800"/>
+          <w:kern w:val="0"/>
+          <w:sz w:val="21"/>
+          <w:szCs w:val="21"/>
+          <w14:ligatures w14:val="none"/>
+        </w:rPr>
+        <w:t>res</w:t>
+      </w:r>
+      <w:r>
+        <w:rPr>
+          <w:rFonts w:ascii="Consolas" w:eastAsia="Times New Roman" w:hAnsi="Consolas" w:cs="Times New Roman"/>
+          <w:color w:val="1F2328"/>
+          <w:kern w:val="0"/>
+          <w:sz w:val="21"/>
+          <w:szCs w:val="21"/>
+          <w14:ligatures w14:val="none"/>
+        </w:rPr>
+        <w:t>.</w:t>
+      </w:r>
+      <w:r>
+        <w:rPr>
+          <w:rFonts w:ascii="Consolas" w:eastAsia="Times New Roman" w:hAnsi="Consolas" w:cs="Times New Roman"/>
+          <w:color w:val="8250DF"/>
+          <w:kern w:val="0"/>
+          <w:sz w:val="21"/>
+          <w:szCs w:val="21"/>
+          <w14:ligatures w14:val="none"/>
+        </w:rPr>
+        <w:t>json</w:t>
+      </w:r>
+      <w:r>
+        <w:rPr>
+          <w:rFonts w:ascii="Consolas" w:eastAsia="Times New Roman" w:hAnsi="Consolas" w:cs="Times New Roman"/>
+          <w:color w:val="1F2328"/>
+          <w:kern w:val="0"/>
+          <w:sz w:val="21"/>
+          <w:szCs w:val="21"/>
+          <w14:ligatures w14:val="none"/>
+        </w:rPr>
+        <w:t>({</w:t>
+      </w:r>
+    </w:p>
+    <w:p>
+      <w:pPr>
+        <w:shd w:val="clear" w:color="auto" w:fill="FFFFFF"/>
+        <w:spacing w:after="0" w:line="285" w:lineRule="atLeast"/>
+        <w:rPr>
+          <w:rFonts w:ascii="Consolas" w:eastAsia="Times New Roman" w:hAnsi="Consolas" w:cs="Times New Roman"/>
+          <w:color w:val="202020"/>
+          <w:kern w:val="0"/>
+          <w:sz w:val="21"/>
+          <w:szCs w:val="21"/>
+          <w14:ligatures w14:val="none"/>
+        </w:rPr>
+      </w:pPr>
+      <w:r>
+        <w:rPr>
+          <w:rFonts w:ascii="Consolas" w:eastAsia="Times New Roman" w:hAnsi="Consolas" w:cs="Times New Roman"/>
+          <w:color w:val="1F2328"/>
+          <w:kern w:val="0"/>
+          <w:sz w:val="21"/>
+          <w:szCs w:val="21"/>
+          <w14:ligatures w14:val="none"/>
+        </w:rPr>
+        <w:t>      success</w:t>
+      </w:r>
+      <w:r>
+        <w:rPr>
+          <w:rFonts w:ascii="Consolas" w:eastAsia="Times New Roman" w:hAnsi="Consolas" w:cs="Times New Roman"/>
+          <w:color w:val="001080"/>
+          <w:kern w:val="0"/>
+          <w:sz w:val="21"/>
+          <w:szCs w:val="21"/>
+          <w14:ligatures w14:val="none"/>
+        </w:rPr>
+        <w:t>:</w:t>
+      </w:r>
+      <w:r>
+        <w:rPr>
+          <w:rFonts w:ascii="Consolas" w:eastAsia="Times New Roman" w:hAnsi="Consolas" w:cs="Times New Roman"/>
+          <w:color w:val="1F2328"/>
+          <w:kern w:val="0"/>
+          <w:sz w:val="21"/>
+          <w:szCs w:val="21"/>
+          <w14:ligatures w14:val="none"/>
+        </w:rPr>
+        <w:t xml:space="preserve"> </w:t>
+      </w:r>
+      <w:r>
+        <w:rPr>
+          <w:rFonts w:ascii="Consolas" w:eastAsia="Times New Roman" w:hAnsi="Consolas" w:cs="Times New Roman"/>
+          <w:color w:val="0000FF"/>
+          <w:kern w:val="0"/>
+          <w:sz w:val="21"/>
+          <w:szCs w:val="21"/>
+          <w14:ligatures w14:val="none"/>
+        </w:rPr>
+        <w:t>true</w:t>
+      </w:r>
+      <w:r>
+        <w:rPr>
+          <w:rFonts w:ascii="Consolas" w:eastAsia="Times New Roman" w:hAnsi="Consolas" w:cs="Times New Roman"/>
+          <w:color w:val="1F2328"/>
+          <w:kern w:val="0"/>
+          <w:sz w:val="21"/>
+          <w:szCs w:val="21"/>
+          <w14:ligatures w14:val="none"/>
+        </w:rPr>
+        <w:t>,</w:t>
+      </w:r>
+    </w:p>
+    <w:p>
+      <w:pPr>
+        <w:shd w:val="clear" w:color="auto" w:fill="FFFFFF"/>
+        <w:spacing w:after="0" w:line="285" w:lineRule="atLeast"/>
+        <w:rPr>
+          <w:rFonts w:ascii="Consolas" w:eastAsia="Times New Roman" w:hAnsi="Consolas" w:cs="Times New Roman"/>
+          <w:color w:val="202020"/>
+          <w:kern w:val="0"/>
+          <w:sz w:val="21"/>
+          <w:szCs w:val="21"/>
+          <w14:ligatures w14:val="none"/>
+        </w:rPr>
+      </w:pPr>
+      <w:r>
+        <w:rPr>
+          <w:rFonts w:ascii="Consolas" w:eastAsia="Times New Roman" w:hAnsi="Consolas" w:cs="Times New Roman"/>
+          <w:color w:val="1F2328"/>
+          <w:kern w:val="0"/>
+          <w:sz w:val="21"/>
+          <w:szCs w:val="21"/>
+          <w14:ligatures w14:val="none"/>
+        </w:rPr>
+        <w:t>      message</w:t>
+      </w:r>
+      <w:r>
+        <w:rPr>
+          <w:rFonts w:ascii="Consolas" w:eastAsia="Times New Roman" w:hAnsi="Consolas" w:cs="Times New Roman"/>
+          <w:color w:val="001080"/>
+          <w:kern w:val="0"/>
+          <w:sz w:val="21"/>
+          <w:szCs w:val="21"/>
+          <w14:ligatures w14:val="none"/>
+        </w:rPr>
+        <w:t>:</w:t>
+      </w:r>
+      <w:r>
+        <w:rPr>
+          <w:rFonts w:ascii="Consolas" w:eastAsia="Times New Roman" w:hAnsi="Consolas" w:cs="Times New Roman"/>
+          <w:color w:val="1F2328"/>
+          <w:kern w:val="0"/>
+          <w:sz w:val="21"/>
+          <w:szCs w:val="21"/>
+          <w14:ligatures w14:val="none"/>
+        </w:rPr>
+        <w:t xml:space="preserve"> </w:t>
+      </w:r>
+      <w:r>
+        <w:rPr>
+          <w:rFonts w:ascii="Consolas" w:eastAsia="Times New Roman" w:hAnsi="Consolas" w:cs="Times New Roman"/>
+          <w:color w:val="953800"/>
+          <w:kern w:val="0"/>
+          <w:sz w:val="21"/>
+          <w:szCs w:val="21"/>
+          <w14:ligatures w14:val="none"/>
+        </w:rPr>
+        <w:t>req</w:t>
+      </w:r>
+      <w:r>
+        <w:rPr>
+          <w:rFonts w:ascii="Consolas" w:eastAsia="Times New Roman" w:hAnsi="Consolas" w:cs="Times New Roman"/>
+          <w:color w:val="1F2328"/>
+          <w:kern w:val="0"/>
+          <w:sz w:val="21"/>
+          <w:szCs w:val="21"/>
+          <w14:ligatures w14:val="none"/>
+        </w:rPr>
+        <w:t>.</w:t>
+      </w:r>
+      <w:r>
+        <w:rPr>
+          <w:rFonts w:ascii="Consolas" w:eastAsia="Times New Roman" w:hAnsi="Consolas" w:cs="Times New Roman"/>
+          <w:color w:val="8250DF"/>
+          <w:kern w:val="0"/>
+          <w:sz w:val="21"/>
+          <w:szCs w:val="21"/>
+          <w14:ligatures w14:val="none"/>
+        </w:rPr>
+        <w:t>__</w:t>
+      </w:r>
+      <w:r>
+        <w:rPr>
+          <w:rFonts w:ascii="Consolas" w:eastAsia="Times New Roman" w:hAnsi="Consolas" w:cs="Times New Roman"/>
+          <w:color w:val="1F2328"/>
+          <w:kern w:val="0"/>
+          <w:sz w:val="21"/>
+          <w:szCs w:val="21"/>
+          <w14:ligatures w14:val="none"/>
+        </w:rPr>
+        <w:t>(</w:t>
+      </w:r>
+      <w:r>
+        <w:rPr>
+          <w:rFonts w:ascii="Consolas" w:eastAsia="Times New Roman" w:hAnsi="Consolas" w:cs="Times New Roman"/>
+          <w:color w:val="0A3069"/>
+          <w:kern w:val="0"/>
+          <w:sz w:val="21"/>
+          <w:szCs w:val="21"/>
+          <w14:ligatures w14:val="none"/>
+        </w:rPr>
+        <w:t>'Login successful'</w:t>
+      </w:r>
+      <w:r>
+        <w:rPr>
+          <w:rFonts w:ascii="Consolas" w:eastAsia="Times New Roman" w:hAnsi="Consolas" w:cs="Times New Roman"/>
+          <w:color w:val="1F2328"/>
+          <w:kern w:val="0"/>
+          <w:sz w:val="21"/>
+          <w:szCs w:val="21"/>
+          <w14:ligatures w14:val="none"/>
+        </w:rPr>
+        <w:t>),</w:t>
+      </w:r>
+    </w:p>
+    <w:p>
+      <w:pPr>
+        <w:shd w:val="clear" w:color="auto" w:fill="FFFFFF"/>
+        <w:spacing w:after="0" w:line="285" w:lineRule="atLeast"/>
+        <w:rPr>
+          <w:rFonts w:ascii="Consolas" w:eastAsia="Times New Roman" w:hAnsi="Consolas" w:cs="Times New Roman"/>
+          <w:color w:val="202020"/>
+          <w:kern w:val="0"/>
+          <w:sz w:val="21"/>
+          <w:szCs w:val="21"/>
+          <w14:ligatures w14:val="none"/>
+        </w:rPr>
+      </w:pPr>
+      <w:r>
+        <w:rPr>
+          <w:rFonts w:ascii="Consolas" w:eastAsia="Times New Roman" w:hAnsi="Consolas" w:cs="Times New Roman"/>
+          <w:color w:val="1F2328"/>
+          <w:kern w:val="0"/>
+          <w:sz w:val="21"/>
+          <w:szCs w:val="21"/>
+          <w14:ligatures w14:val="none"/>
+        </w:rPr>
+        <w:t>      token</w:t>
+      </w:r>
+      <w:r>
+        <w:rPr>
+          <w:rFonts w:ascii="Consolas" w:eastAsia="Times New Roman" w:hAnsi="Consolas" w:cs="Times New Roman"/>
+          <w:color w:val="001080"/>
+          <w:kern w:val="0"/>
+          <w:sz w:val="21"/>
+          <w:szCs w:val="21"/>
+          <w14:ligatures w14:val="none"/>
+        </w:rPr>
+        <w:t>:</w:t>
+      </w:r>
+      <w:r>
+        <w:rPr>
+          <w:rFonts w:ascii="Consolas" w:eastAsia="Times New Roman" w:hAnsi="Consolas" w:cs="Times New Roman"/>
+          <w:color w:val="1F2328"/>
+          <w:kern w:val="0"/>
+          <w:sz w:val="21"/>
+          <w:szCs w:val="21"/>
+          <w14:ligatures w14:val="none"/>
+        </w:rPr>
+        <w:t xml:space="preserve"> </w:t>
+      </w:r>
+      <w:r>
+        <w:rPr>
+          <w:rFonts w:ascii="Consolas" w:eastAsia="Times New Roman" w:hAnsi="Consolas" w:cs="Times New Roman"/>
+          <w:color w:val="0A3069"/>
+          <w:kern w:val="0"/>
+          <w:sz w:val="21"/>
+          <w:szCs w:val="21"/>
+          <w14:ligatures w14:val="none"/>
+        </w:rPr>
+        <w:t>'jwt-token-here'</w:t>
+      </w:r>
+    </w:p>
+    <w:p>
+      <w:pPr>
+        <w:shd w:val="clear" w:color="auto" w:fill="FFFFFF"/>
+        <w:spacing w:after="0" w:line="285" w:lineRule="atLeast"/>
+        <w:rPr>
+          <w:rFonts w:ascii="Consolas" w:eastAsia="Times New Roman" w:hAnsi="Consolas" w:cs="Times New Roman"/>
+          <w:color w:val="202020"/>
+          <w:kern w:val="0"/>
+          <w:sz w:val="21"/>
+          <w:szCs w:val="21"/>
+          <w14:ligatures w14:val="none"/>
+        </w:rPr>
+      </w:pPr>
+      <w:r>
+        <w:rPr>
+          <w:rFonts w:ascii="Consolas" w:eastAsia="Times New Roman" w:hAnsi="Consolas" w:cs="Times New Roman"/>
+          <w:color w:val="1F2328"/>
+          <w:kern w:val="0"/>
+          <w:sz w:val="21"/>
+          <w:szCs w:val="21"/>
+          <w14:ligatures w14:val="none"/>
+        </w:rPr>
+        <w:t>    });</w:t>
+      </w:r>
+    </w:p>
+    <w:p>
+      <w:pPr>
+        <w:shd w:val="clear" w:color="auto" w:fill="FFFFFF"/>
+        <w:spacing w:after="0" w:line="285" w:lineRule="atLeast"/>
+        <w:rPr>
+          <w:rFonts w:ascii="Consolas" w:eastAsia="Times New Roman" w:hAnsi="Consolas" w:cs="Times New Roman"/>
+          <w:color w:val="202020"/>
+          <w:kern w:val="0"/>
+          <w:sz w:val="21"/>
+          <w:szCs w:val="21"/>
+          <w14:ligatures w14:val="none"/>
+        </w:rPr>
+      </w:pPr>
+      <w:r>
+        <w:rPr>
+          <w:rFonts w:ascii="Consolas" w:eastAsia="Times New Roman" w:hAnsi="Consolas" w:cs="Times New Roman"/>
+          <w:color w:val="1F2328"/>
+          <w:kern w:val="0"/>
+          <w:sz w:val="21"/>
+          <w:szCs w:val="21"/>
+          <w14:ligatures w14:val="none"/>
+        </w:rPr>
+        <w:t>  }</w:t>
+      </w:r>
+    </w:p>
+    <w:p>
+      <w:pPr>
+        <w:shd w:val="clear" w:color="auto" w:fill="FFFFFF"/>
+        <w:spacing w:after="0" w:line="285" w:lineRule="atLeast"/>
+        <w:rPr>
+          <w:rFonts w:ascii="Consolas" w:eastAsia="Times New Roman" w:hAnsi="Consolas" w:cs="Times New Roman"/>
+          <w:color w:val="202020"/>
+          <w:kern w:val="0"/>
+          <w:sz w:val="21"/>
+          <w:szCs w:val="21"/>
+          <w14:ligatures w14:val="none"/>
+        </w:rPr>
+      </w:pPr>
+      <w:r>
+        <w:rPr>
+          <w:rFonts w:ascii="Consolas" w:eastAsia="Times New Roman" w:hAnsi="Consolas" w:cs="Times New Roman"/>
+          <w:color w:val="202020"/>
+          <w:kern w:val="0"/>
+          <w:sz w:val="21"/>
+          <w:szCs w:val="21"/>
+          <w14:ligatures w14:val="none"/>
+        </w:rPr>
+        <w:t>);</w:t>
+      </w:r>
+    </w:p>
+    <w:p>
+      <w:pPr>
+        <w:shd w:val="clear" w:color="auto" w:fill="FFFFFF"/>
+        <w:spacing w:after="0" w:line="285" w:lineRule="atLeast"/>
+        <w:rPr>
+          <w:rFonts w:ascii="Consolas" w:eastAsia="Times New Roman" w:hAnsi="Consolas" w:cs="Times New Roman"/>
+          <w:color w:val="202020"/>
+          <w:kern w:val="0"/>
+          <w:sz w:val="21"/>
+          <w:szCs w:val="21"/>
+          <w14:ligatures w14:val="none"/>
+        </w:rPr>
+      </w:pPr>
+    </w:p>
+    <w:p>
+      <w:pPr>
+        <w:shd w:val="clear" w:color="auto" w:fill="FFFFFF"/>
+        <w:spacing w:after="0" w:line="285" w:lineRule="atLeast"/>
+        <w:rPr>
+          <w:rFonts w:ascii="Consolas" w:eastAsia="Times New Roman" w:hAnsi="Consolas" w:cs="Times New Roman"/>
+          <w:color w:val="202020"/>
+          <w:kern w:val="0"/>
+          <w:sz w:val="21"/>
+          <w:szCs w:val="21"/>
+          <w14:ligatures w14:val="none"/>
+        </w:rPr>
+      </w:pPr>
+      <w:r>
+        <w:rPr>
+          <w:rFonts w:ascii="Consolas" w:eastAsia="Times New Roman" w:hAnsi="Consolas" w:cs="Times New Roman"/>
+          <w:color w:val="0550AE"/>
+          <w:kern w:val="0"/>
+          <w:sz w:val="21"/>
+          <w:szCs w:val="21"/>
+          <w14:ligatures w14:val="none"/>
+        </w:rPr>
+        <w:t>module</w:t>
+      </w:r>
+      <w:r>
+        <w:rPr>
+          <w:rFonts w:ascii="Consolas" w:eastAsia="Times New Roman" w:hAnsi="Consolas" w:cs="Times New Roman"/>
+          <w:color w:val="202020"/>
+          <w:kern w:val="0"/>
+          <w:sz w:val="21"/>
+          <w:szCs w:val="21"/>
+          <w14:ligatures w14:val="none"/>
+        </w:rPr>
+        <w:t>.</w:t>
+      </w:r>
+      <w:r>
+        <w:rPr>
+          <w:rFonts w:ascii="Consolas" w:eastAsia="Times New Roman" w:hAnsi="Consolas" w:cs="Times New Roman"/>
+          <w:color w:val="0550AE"/>
+          <w:kern w:val="0"/>
+          <w:sz w:val="21"/>
+          <w:szCs w:val="21"/>
+          <w14:ligatures w14:val="none"/>
+        </w:rPr>
+        <w:t>exports</w:t>
+      </w:r>
+      <w:r>
+        <w:rPr>
+          <w:rFonts w:ascii="Consolas" w:eastAsia="Times New Roman" w:hAnsi="Consolas" w:cs="Times New Roman"/>
+          <w:color w:val="202020"/>
+          <w:kern w:val="0"/>
+          <w:sz w:val="21"/>
+          <w:szCs w:val="21"/>
+          <w14:ligatures w14:val="none"/>
+        </w:rPr>
+        <w:t xml:space="preserve"> </w:t>
+      </w:r>
+      <w:r>
+        <w:rPr>
+          <w:rFonts w:ascii="Consolas" w:eastAsia="Times New Roman" w:hAnsi="Consolas" w:cs="Times New Roman"/>
+          <w:color w:val="000000"/>
+          <w:kern w:val="0"/>
+          <w:sz w:val="21"/>
+          <w:szCs w:val="21"/>
+          <w14:ligatures w14:val="none"/>
+        </w:rPr>
+        <w:t>=</w:t>
+      </w:r>
+      <w:r>
+        <w:rPr>
+          <w:rFonts w:ascii="Consolas" w:eastAsia="Times New Roman" w:hAnsi="Consolas" w:cs="Times New Roman"/>
+          <w:color w:val="202020"/>
+          <w:kern w:val="0"/>
+          <w:sz w:val="21"/>
+          <w:szCs w:val="21"/>
+          <w14:ligatures w14:val="none"/>
+        </w:rPr>
+        <w:t xml:space="preserve"> </w:t>
+      </w:r>
+      <w:r>
+        <w:rPr>
+          <w:rFonts w:ascii="Consolas" w:eastAsia="Times New Roman" w:hAnsi="Consolas" w:cs="Times New Roman"/>
+          <w:color w:val="0550AE"/>
+          <w:kern w:val="0"/>
+          <w:sz w:val="21"/>
+          <w:szCs w:val="21"/>
+          <w14:ligatures w14:val="none"/>
+        </w:rPr>
+        <w:t>router</w:t>
+      </w:r>
+      <w:r>
+        <w:rPr>
+          <w:rFonts w:ascii="Consolas" w:eastAsia="Times New Roman" w:hAnsi="Consolas" w:cs="Times New Roman"/>
+          <w:color w:val="202020"/>
+          <w:kern w:val="0"/>
+          <w:sz w:val="21"/>
+          <w:szCs w:val="21"/>
+          <w14:ligatures w14:val="none"/>
+        </w:rPr>
+        <w:t>;</w:t>
+      </w:r>
+    </w:p>
+    <w:p>
+      <w:pPr>
+        <w:ind w:left="1440" w:firstLine="720"/>
+        <w:rPr>
+          <w:rFonts w:ascii="Sakkal Majalla" w:hAnsi="Sakkal Majalla" w:cs="Sakkal Majalla"/>
+        </w:rPr>
+      </w:pPr>
+      <w:r>
+        <w:rPr>
+          <w:rFonts w:ascii="Sakkal Majalla" w:hAnsi="Sakkal Majalla" w:cs="Sakkal Majalla"/>
+        </w:rPr>
+        <w:t>================================================</w:t>
+      </w:r>
+    </w:p>
+    <w:p>
+      <w:pPr>
+        <w:shd w:val="clear" w:color="auto" w:fill="FFFFFF"/>
+        <w:spacing w:after="0" w:line="285" w:lineRule="atLeast"/>
+        <w:rPr>
+          <w:rFonts w:ascii="Sakkal Majalla" w:eastAsia="Times New Roman" w:hAnsi="Sakkal Majalla" w:cs="Sakkal Majalla"/>
+          <w:color w:val="202020"/>
+          <w:kern w:val="0"/>
+          <w14:ligatures w14:val="none"/>
+        </w:rPr>
+      </w:pPr>
+      <w:r>
+        <w:rPr>
+          <w:rFonts w:ascii="Sakkal Majalla" w:eastAsia="Times New Roman" w:hAnsi="Sakkal Majalla" w:cs="Sakkal Majalla"/>
+          <w:color w:val="202020"/>
+          <w:kern w:val="0"/>
+          <w14:ligatures w14:val="none"/>
+        </w:rPr>
+        <w:t>Register the login and register routers with the middleware:</w:t>
+      </w:r>
+    </w:p>
+    <w:p>
+      <w:pPr>
+        <w:shd w:val="clear" w:color="auto" w:fill="FFFFFF"/>
+        <w:spacing w:after="0" w:line="285" w:lineRule="atLeast"/>
+        <w:rPr>
+          <w:rFonts w:ascii="Consolas" w:eastAsia="Times New Roman" w:hAnsi="Consolas" w:cs="Times New Roman"/>
+          <w:color w:val="202020"/>
+          <w:kern w:val="0"/>
+          <w:sz w:val="21"/>
+          <w:szCs w:val="21"/>
+          <w14:ligatures w14:val="none"/>
+        </w:rPr>
+      </w:pPr>
+      <w:r>
+        <w:rPr>
+          <w:rFonts w:ascii="Consolas" w:eastAsia="Times New Roman" w:hAnsi="Consolas" w:cs="Times New Roman"/>
+          <w:color w:val="0550AE"/>
+          <w:kern w:val="0"/>
+          <w:sz w:val="21"/>
+          <w:szCs w:val="21"/>
+          <w14:ligatures w14:val="none"/>
+        </w:rPr>
+        <w:t>app</w:t>
+      </w:r>
+      <w:r>
+        <w:rPr>
+          <w:rFonts w:ascii="Consolas" w:eastAsia="Times New Roman" w:hAnsi="Consolas" w:cs="Times New Roman"/>
+          <w:color w:val="202020"/>
+          <w:kern w:val="0"/>
+          <w:sz w:val="21"/>
+          <w:szCs w:val="21"/>
+          <w14:ligatures w14:val="none"/>
+        </w:rPr>
+        <w:t>.</w:t>
+      </w:r>
+      <w:r>
+        <w:rPr>
+          <w:rFonts w:ascii="Consolas" w:eastAsia="Times New Roman" w:hAnsi="Consolas" w:cs="Times New Roman"/>
+          <w:color w:val="8250DF"/>
+          <w:kern w:val="0"/>
+          <w:sz w:val="21"/>
+          <w:szCs w:val="21"/>
+          <w14:ligatures w14:val="none"/>
+        </w:rPr>
+        <w:t>use</w:t>
+      </w:r>
+      <w:r>
+        <w:rPr>
+          <w:rFonts w:ascii="Consolas" w:eastAsia="Times New Roman" w:hAnsi="Consolas" w:cs="Times New Roman"/>
+          <w:color w:val="202020"/>
+          <w:kern w:val="0"/>
+          <w:sz w:val="21"/>
+          <w:szCs w:val="21"/>
+          <w14:ligatures w14:val="none"/>
+        </w:rPr>
+        <w:t>(</w:t>
+      </w:r>
+      <w:r>
+        <w:rPr>
+          <w:rFonts w:ascii="Consolas" w:eastAsia="Times New Roman" w:hAnsi="Consolas" w:cs="Times New Roman"/>
+          <w:color w:val="0A3069"/>
+          <w:kern w:val="0"/>
+          <w:sz w:val="21"/>
+          <w:szCs w:val="21"/>
+          <w14:ligatures w14:val="none"/>
+        </w:rPr>
+        <w:t>'/'</w:t>
+      </w:r>
+      <w:r>
+        <w:rPr>
+          <w:rFonts w:ascii="Consolas" w:eastAsia="Times New Roman" w:hAnsi="Consolas" w:cs="Times New Roman"/>
+          <w:color w:val="202020"/>
+          <w:kern w:val="0"/>
+          <w:sz w:val="21"/>
+          <w:szCs w:val="21"/>
+          <w14:ligatures w14:val="none"/>
+        </w:rPr>
+        <w:t xml:space="preserve">, </w:t>
+      </w:r>
+      <w:r>
+        <w:rPr>
+          <w:rFonts w:ascii="Consolas" w:eastAsia="Times New Roman" w:hAnsi="Consolas" w:cs="Times New Roman"/>
+          <w:color w:val="267F99"/>
+          <w:kern w:val="0"/>
+          <w:sz w:val="21"/>
+          <w:szCs w:val="21"/>
+          <w14:ligatures w14:val="none"/>
+        </w:rPr>
+        <w:t>ValidationMiddleware</w:t>
+      </w:r>
+      <w:r>
+        <w:rPr>
+          <w:rFonts w:ascii="Consolas" w:eastAsia="Times New Roman" w:hAnsi="Consolas" w:cs="Times New Roman"/>
+          <w:color w:val="202020"/>
+          <w:kern w:val="0"/>
+          <w:sz w:val="21"/>
+          <w:szCs w:val="21"/>
+          <w14:ligatures w14:val="none"/>
+        </w:rPr>
+        <w:t>.</w:t>
+      </w:r>
+      <w:r>
+        <w:rPr>
+          <w:rFonts w:ascii="Consolas" w:eastAsia="Times New Roman" w:hAnsi="Consolas" w:cs="Times New Roman"/>
+          <w:color w:val="8250DF"/>
+          <w:kern w:val="0"/>
+          <w:sz w:val="21"/>
+          <w:szCs w:val="21"/>
+          <w14:ligatures w14:val="none"/>
+        </w:rPr>
+        <w:t>handle</w:t>
+      </w:r>
+      <w:r>
+        <w:rPr>
+          <w:rFonts w:ascii="Consolas" w:eastAsia="Times New Roman" w:hAnsi="Consolas" w:cs="Times New Roman"/>
+          <w:color w:val="202020"/>
+          <w:kern w:val="0"/>
+          <w:sz w:val="21"/>
+          <w:szCs w:val="21"/>
+          <w14:ligatures w14:val="none"/>
+        </w:rPr>
+        <w:t>(</w:t>
+      </w:r>
+      <w:r>
+        <w:rPr>
+          <w:rFonts w:ascii="Consolas" w:eastAsia="Times New Roman" w:hAnsi="Consolas" w:cs="Times New Roman"/>
+          <w:color w:val="0550AE"/>
+          <w:kern w:val="0"/>
+          <w:sz w:val="21"/>
+          <w:szCs w:val="21"/>
+          <w14:ligatures w14:val="none"/>
+        </w:rPr>
+        <w:t>userRegisterValidation</w:t>
+      </w:r>
+      <w:r>
+        <w:rPr>
+          <w:rFonts w:ascii="Consolas" w:eastAsia="Times New Roman" w:hAnsi="Consolas" w:cs="Times New Roman"/>
+          <w:color w:val="202020"/>
+          <w:kern w:val="0"/>
+          <w:sz w:val="21"/>
+          <w:szCs w:val="21"/>
+          <w14:ligatures w14:val="none"/>
+        </w:rPr>
+        <w:t xml:space="preserve">), </w:t>
+      </w:r>
+      <w:r>
+        <w:rPr>
+          <w:rFonts w:ascii="Consolas" w:eastAsia="Times New Roman" w:hAnsi="Consolas" w:cs="Times New Roman"/>
+          <w:color w:val="0550AE"/>
+          <w:kern w:val="0"/>
+          <w:sz w:val="21"/>
+          <w:szCs w:val="21"/>
+          <w14:ligatures w14:val="none"/>
+        </w:rPr>
+        <w:t>registerRouter</w:t>
+      </w:r>
+      <w:r>
+        <w:rPr>
+          <w:rFonts w:ascii="Consolas" w:eastAsia="Times New Roman" w:hAnsi="Consolas" w:cs="Times New Roman"/>
+          <w:color w:val="202020"/>
+          <w:kern w:val="0"/>
+          <w:sz w:val="21"/>
+          <w:szCs w:val="21"/>
+          <w14:ligatures w14:val="none"/>
+        </w:rPr>
+        <w:t>)</w:t>
+      </w:r>
+    </w:p>
+    <w:p>
+      <w:pPr>
+        <w:shd w:val="clear" w:color="auto" w:fill="FFFFFF"/>
+        <w:spacing w:after="0" w:line="285" w:lineRule="atLeast"/>
+        <w:rPr>
+          <w:rFonts w:ascii="Consolas" w:eastAsia="Times New Roman" w:hAnsi="Consolas" w:cs="Times New Roman"/>
+          <w:color w:val="202020"/>
+          <w:kern w:val="0"/>
+          <w:sz w:val="21"/>
+          <w:szCs w:val="21"/>
+          <w14:ligatures w14:val="none"/>
+        </w:rPr>
+      </w:pPr>
+      <w:r>
+        <w:rPr>
+          <w:rFonts w:ascii="Consolas" w:eastAsia="Times New Roman" w:hAnsi="Consolas" w:cs="Times New Roman"/>
+          <w:color w:val="0550AE"/>
+          <w:kern w:val="0"/>
+          <w:sz w:val="21"/>
+          <w:szCs w:val="21"/>
+          <w14:ligatures w14:val="none"/>
+        </w:rPr>
+        <w:t>app</w:t>
+      </w:r>
+      <w:r>
+        <w:rPr>
+          <w:rFonts w:ascii="Consolas" w:eastAsia="Times New Roman" w:hAnsi="Consolas" w:cs="Times New Roman"/>
+          <w:color w:val="202020"/>
+          <w:kern w:val="0"/>
+          <w:sz w:val="21"/>
+          <w:szCs w:val="21"/>
+          <w14:ligatures w14:val="none"/>
+        </w:rPr>
+        <w:t>.</w:t>
+      </w:r>
+      <w:r>
+        <w:rPr>
+          <w:rFonts w:ascii="Consolas" w:eastAsia="Times New Roman" w:hAnsi="Consolas" w:cs="Times New Roman"/>
+          <w:color w:val="8250DF"/>
+          <w:kern w:val="0"/>
+          <w:sz w:val="21"/>
+          <w:szCs w:val="21"/>
+          <w14:ligatures w14:val="none"/>
+        </w:rPr>
+        <w:t>use</w:t>
+      </w:r>
+      <w:r>
+        <w:rPr>
+          <w:rFonts w:ascii="Consolas" w:eastAsia="Times New Roman" w:hAnsi="Consolas" w:cs="Times New Roman"/>
+          <w:color w:val="202020"/>
+          <w:kern w:val="0"/>
+          <w:sz w:val="21"/>
+          <w:szCs w:val="21"/>
+          <w14:ligatures w14:val="none"/>
+        </w:rPr>
+        <w:t>(</w:t>
+      </w:r>
+      <w:r>
+        <w:rPr>
+          <w:rFonts w:ascii="Consolas" w:eastAsia="Times New Roman" w:hAnsi="Consolas" w:cs="Times New Roman"/>
+          <w:color w:val="0A3069"/>
+          <w:kern w:val="0"/>
+          <w:sz w:val="21"/>
+          <w:szCs w:val="21"/>
+          <w14:ligatures w14:val="none"/>
+        </w:rPr>
+        <w:t>'/'</w:t>
+      </w:r>
+      <w:r>
+        <w:rPr>
+          <w:rFonts w:ascii="Consolas" w:eastAsia="Times New Roman" w:hAnsi="Consolas" w:cs="Times New Roman"/>
+          <w:color w:val="202020"/>
+          <w:kern w:val="0"/>
+          <w:sz w:val="21"/>
+          <w:szCs w:val="21"/>
+          <w14:ligatures w14:val="none"/>
+        </w:rPr>
+        <w:t xml:space="preserve">, </w:t>
+      </w:r>
+      <w:r>
+        <w:rPr>
+          <w:rFonts w:ascii="Consolas" w:eastAsia="Times New Roman" w:hAnsi="Consolas" w:cs="Times New Roman"/>
+          <w:color w:val="267F99"/>
+          <w:kern w:val="0"/>
+          <w:sz w:val="21"/>
+          <w:szCs w:val="21"/>
+          <w14:ligatures w14:val="none"/>
+        </w:rPr>
+        <w:t>ValidationMiddleware</w:t>
+      </w:r>
+      <w:r>
+        <w:rPr>
+          <w:rFonts w:ascii="Consolas" w:eastAsia="Times New Roman" w:hAnsi="Consolas" w:cs="Times New Roman"/>
+          <w:color w:val="202020"/>
+          <w:kern w:val="0"/>
+          <w:sz w:val="21"/>
+          <w:szCs w:val="21"/>
+          <w14:ligatures w14:val="none"/>
+        </w:rPr>
+        <w:t>.</w:t>
+      </w:r>
+      <w:r>
+        <w:rPr>
+          <w:rFonts w:ascii="Consolas" w:eastAsia="Times New Roman" w:hAnsi="Consolas" w:cs="Times New Roman"/>
+          <w:color w:val="8250DF"/>
+          <w:kern w:val="0"/>
+          <w:sz w:val="21"/>
+          <w:szCs w:val="21"/>
+          <w14:ligatures w14:val="none"/>
+        </w:rPr>
+        <w:t>handle</w:t>
+      </w:r>
+      <w:r>
+        <w:rPr>
+          <w:rFonts w:ascii="Consolas" w:eastAsia="Times New Roman" w:hAnsi="Consolas" w:cs="Times New Roman"/>
+          <w:color w:val="202020"/>
+          <w:kern w:val="0"/>
+          <w:sz w:val="21"/>
+          <w:szCs w:val="21"/>
+          <w14:ligatures w14:val="none"/>
+        </w:rPr>
+        <w:t>(</w:t>
+      </w:r>
+      <w:r>
+        <w:rPr>
+          <w:rFonts w:ascii="Consolas" w:eastAsia="Times New Roman" w:hAnsi="Consolas" w:cs="Times New Roman"/>
+          <w:color w:val="0550AE"/>
+          <w:kern w:val="0"/>
+          <w:sz w:val="21"/>
+          <w:szCs w:val="21"/>
+          <w14:ligatures w14:val="none"/>
+        </w:rPr>
+        <w:t>loginValidation</w:t>
+      </w:r>
+      <w:r>
+        <w:rPr>
+          <w:rFonts w:ascii="Consolas" w:eastAsia="Times New Roman" w:hAnsi="Consolas" w:cs="Times New Roman"/>
+          <w:color w:val="202020"/>
+          <w:kern w:val="0"/>
+          <w:sz w:val="21"/>
+          <w:szCs w:val="21"/>
+          <w14:ligatures w14:val="none"/>
+        </w:rPr>
+        <w:t xml:space="preserve">), </w:t>
+      </w:r>
+      <w:r>
+        <w:rPr>
+          <w:rFonts w:ascii="Consolas" w:eastAsia="Times New Roman" w:hAnsi="Consolas" w:cs="Times New Roman"/>
+          <w:color w:val="0550AE"/>
+          <w:kern w:val="0"/>
+          <w:sz w:val="21"/>
+          <w:szCs w:val="21"/>
+          <w14:ligatures w14:val="none"/>
+        </w:rPr>
+        <w:t>loginRouter</w:t>
+      </w:r>
+      <w:r>
+        <w:rPr>
+          <w:rFonts w:ascii="Consolas" w:eastAsia="Times New Roman" w:hAnsi="Consolas" w:cs="Times New Roman"/>
+          <w:color w:val="202020"/>
+          <w:kern w:val="0"/>
+          <w:sz w:val="21"/>
+          <w:szCs w:val="21"/>
+          <w14:ligatures w14:val="none"/>
+        </w:rPr>
+        <w:t>)</w:t>
+      </w:r>
+    </w:p>
+    <w:p>
+      <w:pPr>
+        <w:shd w:val="clear" w:color="auto" w:fill="FFFFFF"/>
+        <w:spacing w:after="0" w:line="285" w:lineRule="atLeast"/>
+        <w:rPr>
+          <w:rFonts w:ascii="Consolas" w:eastAsia="Times New Roman" w:hAnsi="Consolas" w:cs="Times New Roman"/>
+          <w:color w:val="202020"/>
+          <w:kern w:val="0"/>
+          <w:sz w:val="21"/>
+          <w:szCs w:val="21"/>
+          <w14:ligatures w14:val="none"/>
+        </w:rPr>
+      </w:pPr>
+      <w:r>
+        <w:rPr>
+          <w:rFonts w:ascii="Consolas" w:eastAsia="Times New Roman" w:hAnsi="Consolas" w:cs="Times New Roman"/>
+          <w:color w:val="0550AE"/>
+          <w:kern w:val="0"/>
+          <w:sz w:val="21"/>
+          <w:szCs w:val="21"/>
+          <w14:ligatures w14:val="none"/>
+        </w:rPr>
+        <w:t>app</w:t>
+      </w:r>
+      <w:r>
+        <w:rPr>
+          <w:rFonts w:ascii="Consolas" w:eastAsia="Times New Roman" w:hAnsi="Consolas" w:cs="Times New Roman"/>
+          <w:color w:val="202020"/>
+          <w:kern w:val="0"/>
+          <w:sz w:val="21"/>
+          <w:szCs w:val="21"/>
+          <w14:ligatures w14:val="none"/>
+        </w:rPr>
+        <w:t>.</w:t>
+      </w:r>
+      <w:r>
+        <w:rPr>
+          <w:rFonts w:ascii="Consolas" w:eastAsia="Times New Roman" w:hAnsi="Consolas" w:cs="Times New Roman"/>
+          <w:color w:val="8250DF"/>
+          <w:kern w:val="0"/>
+          <w:sz w:val="21"/>
+          <w:szCs w:val="21"/>
+          <w14:ligatures w14:val="none"/>
+        </w:rPr>
+        <w:t>use</w:t>
+      </w:r>
+      <w:r>
+        <w:rPr>
+          <w:rFonts w:ascii="Consolas" w:eastAsia="Times New Roman" w:hAnsi="Consolas" w:cs="Times New Roman"/>
+          <w:color w:val="202020"/>
+          <w:kern w:val="0"/>
+          <w:sz w:val="21"/>
+          <w:szCs w:val="21"/>
+          <w14:ligatures w14:val="none"/>
+        </w:rPr>
+        <w:t>(</w:t>
+      </w:r>
+      <w:r>
+        <w:rPr>
+          <w:rFonts w:ascii="Consolas" w:eastAsia="Times New Roman" w:hAnsi="Consolas" w:cs="Times New Roman"/>
+          <w:color w:val="0A3069"/>
+          <w:kern w:val="0"/>
+          <w:sz w:val="21"/>
+          <w:szCs w:val="21"/>
+          <w14:ligatures w14:val="none"/>
+        </w:rPr>
+        <w:t>'/'</w:t>
+      </w:r>
+      <w:r>
+        <w:rPr>
+          <w:rFonts w:ascii="Consolas" w:eastAsia="Times New Roman" w:hAnsi="Consolas" w:cs="Times New Roman"/>
+          <w:color w:val="202020"/>
+          <w:kern w:val="0"/>
+          <w:sz w:val="21"/>
+          <w:szCs w:val="21"/>
+          <w14:ligatures w14:val="none"/>
+        </w:rPr>
+        <w:t xml:space="preserve">, </w:t>
+      </w:r>
+      <w:r>
+        <w:rPr>
+          <w:rFonts w:ascii="Consolas" w:eastAsia="Times New Roman" w:hAnsi="Consolas" w:cs="Times New Roman"/>
+          <w:color w:val="0550AE"/>
+          <w:kern w:val="0"/>
+          <w:sz w:val="21"/>
+          <w:szCs w:val="21"/>
+          <w14:ligatures w14:val="none"/>
+        </w:rPr>
+        <w:t>localeRouter</w:t>
+      </w:r>
+      <w:r>
+        <w:rPr>
+          <w:rFonts w:ascii="Consolas" w:eastAsia="Times New Roman" w:hAnsi="Consolas" w:cs="Times New Roman"/>
+          <w:color w:val="202020"/>
+          <w:kern w:val="0"/>
+          <w:sz w:val="21"/>
+          <w:szCs w:val="21"/>
+          <w14:ligatures w14:val="none"/>
+        </w:rPr>
+        <w:t>)</w:t>
+      </w:r>
+    </w:p>
+    <w:p>
+      <w:pPr>
+        <w:shd w:val="clear" w:color="auto" w:fill="FFFFFF"/>
+        <w:spacing w:after="0" w:line="285" w:lineRule="atLeast"/>
+        <w:rPr>
+          <w:rFonts w:ascii="Consolas" w:eastAsia="Times New Roman" w:hAnsi="Consolas" w:cs="Times New Roman"/>
+          <w:color w:val="202020"/>
+          <w:kern w:val="0"/>
+          <w:sz w:val="21"/>
+          <w:szCs w:val="21"/>
+          <w14:ligatures w14:val="none"/>
+        </w:rPr>
+      </w:pPr>
+    </w:p>
+    <w:p>
+      <w:pPr>
+        <w:shd w:val="clear" w:color="auto" w:fill="FFFFFF"/>
+        <w:spacing w:after="0" w:line="285" w:lineRule="atLeast"/>
+        <w:rPr>
+          <w:rFonts w:ascii="Consolas" w:eastAsia="Times New Roman" w:hAnsi="Consolas" w:cs="Times New Roman"/>
+          <w:color w:val="202020"/>
+          <w:kern w:val="0"/>
+          <w:sz w:val="21"/>
+          <w:szCs w:val="21"/>
+          <w14:ligatures w14:val="none"/>
+        </w:rPr>
+      </w:pPr>
+      <w:r>
+        <w:rPr>
+          <w:rFonts w:ascii="Consolas" w:eastAsia="Times New Roman" w:hAnsi="Consolas" w:cs="Times New Roman"/>
+          <w:color w:val="6E7781"/>
+          <w:kern w:val="0"/>
+          <w:sz w:val="21"/>
+          <w:szCs w:val="21"/>
+          <w14:ligatures w14:val="none"/>
+        </w:rPr>
+        <w:t>// Error handler</w:t>
+      </w:r>
+    </w:p>
+    <w:p>
+      <w:pPr>
+        <w:shd w:val="clear" w:color="auto" w:fill="FFFFFF"/>
+        <w:spacing w:after="0" w:line="285" w:lineRule="atLeast"/>
+        <w:rPr>
+          <w:rFonts w:ascii="Consolas" w:eastAsia="Times New Roman" w:hAnsi="Consolas" w:cs="Times New Roman"/>
+          <w:color w:val="202020"/>
+          <w:kern w:val="0"/>
+          <w:sz w:val="21"/>
+          <w:szCs w:val="21"/>
+          <w14:ligatures w14:val="none"/>
+        </w:rPr>
+      </w:pPr>
+      <w:r>
+        <w:rPr>
+          <w:rFonts w:ascii="Consolas" w:eastAsia="Times New Roman" w:hAnsi="Consolas" w:cs="Times New Roman"/>
+          <w:color w:val="0550AE"/>
+          <w:kern w:val="0"/>
+          <w:sz w:val="21"/>
+          <w:szCs w:val="21"/>
+          <w14:ligatures w14:val="none"/>
+        </w:rPr>
+        <w:t>app</w:t>
+      </w:r>
+      <w:r>
+        <w:rPr>
+          <w:rFonts w:ascii="Consolas" w:eastAsia="Times New Roman" w:hAnsi="Consolas" w:cs="Times New Roman"/>
+          <w:color w:val="202020"/>
+          <w:kern w:val="0"/>
+          <w:sz w:val="21"/>
+          <w:szCs w:val="21"/>
+          <w14:ligatures w14:val="none"/>
+        </w:rPr>
+        <w:t>.</w:t>
+      </w:r>
+      <w:r>
+        <w:rPr>
+          <w:rFonts w:ascii="Consolas" w:eastAsia="Times New Roman" w:hAnsi="Consolas" w:cs="Times New Roman"/>
+          <w:color w:val="8250DF"/>
+          <w:kern w:val="0"/>
+          <w:sz w:val="21"/>
+          <w:szCs w:val="21"/>
+          <w14:ligatures w14:val="none"/>
+        </w:rPr>
+        <w:t>use</w:t>
+      </w:r>
+      <w:r>
+        <w:rPr>
+          <w:rFonts w:ascii="Consolas" w:eastAsia="Times New Roman" w:hAnsi="Consolas" w:cs="Times New Roman"/>
+          <w:color w:val="202020"/>
+          <w:kern w:val="0"/>
+          <w:sz w:val="21"/>
+          <w:szCs w:val="21"/>
+          <w14:ligatures w14:val="none"/>
+        </w:rPr>
+        <w:t>((</w:t>
+      </w:r>
+      <w:r>
+        <w:rPr>
+          <w:rFonts w:ascii="Consolas" w:eastAsia="Times New Roman" w:hAnsi="Consolas" w:cs="Times New Roman"/>
+          <w:color w:val="953800"/>
+          <w:kern w:val="0"/>
+          <w:sz w:val="21"/>
+          <w:szCs w:val="21"/>
+          <w14:ligatures w14:val="none"/>
+        </w:rPr>
+        <w:t>err</w:t>
+      </w:r>
+      <w:r>
+        <w:rPr>
+          <w:rFonts w:ascii="Consolas" w:eastAsia="Times New Roman" w:hAnsi="Consolas" w:cs="Times New Roman"/>
+          <w:color w:val="202020"/>
+          <w:kern w:val="0"/>
+          <w:sz w:val="21"/>
+          <w:szCs w:val="21"/>
+          <w14:ligatures w14:val="none"/>
+        </w:rPr>
+        <w:t xml:space="preserve">, </w:t>
+      </w:r>
+      <w:r>
+        <w:rPr>
+          <w:rFonts w:ascii="Consolas" w:eastAsia="Times New Roman" w:hAnsi="Consolas" w:cs="Times New Roman"/>
+          <w:color w:val="953800"/>
+          <w:kern w:val="0"/>
+          <w:sz w:val="21"/>
+          <w:szCs w:val="21"/>
+          <w14:ligatures w14:val="none"/>
+        </w:rPr>
+        <w:t>req</w:t>
+      </w:r>
+      <w:r>
+        <w:rPr>
+          <w:rFonts w:ascii="Consolas" w:eastAsia="Times New Roman" w:hAnsi="Consolas" w:cs="Times New Roman"/>
+          <w:color w:val="202020"/>
+          <w:kern w:val="0"/>
+          <w:sz w:val="21"/>
+          <w:szCs w:val="21"/>
+          <w14:ligatures w14:val="none"/>
+        </w:rPr>
+        <w:t xml:space="preserve">, </w:t>
+      </w:r>
+      <w:r>
+        <w:rPr>
+          <w:rFonts w:ascii="Consolas" w:eastAsia="Times New Roman" w:hAnsi="Consolas" w:cs="Times New Roman"/>
+          <w:color w:val="953800"/>
+          <w:kern w:val="0"/>
+          <w:sz w:val="21"/>
+          <w:szCs w:val="21"/>
+          <w14:ligatures w14:val="none"/>
+        </w:rPr>
+        <w:t>res</w:t>
+      </w:r>
+      <w:r>
+        <w:rPr>
+          <w:rFonts w:ascii="Consolas" w:eastAsia="Times New Roman" w:hAnsi="Consolas" w:cs="Times New Roman"/>
+          <w:color w:val="202020"/>
+          <w:kern w:val="0"/>
+          <w:sz w:val="21"/>
+          <w:szCs w:val="21"/>
+          <w14:ligatures w14:val="none"/>
+        </w:rPr>
+        <w:t xml:space="preserve">, </w:t>
+      </w:r>
+      <w:r>
+        <w:rPr>
+          <w:rFonts w:ascii="Consolas" w:eastAsia="Times New Roman" w:hAnsi="Consolas" w:cs="Times New Roman"/>
+          <w:color w:val="953800"/>
+          <w:kern w:val="0"/>
+          <w:sz w:val="21"/>
+          <w:szCs w:val="21"/>
+          <w14:ligatures w14:val="none"/>
+        </w:rPr>
+        <w:t>next</w:t>
+      </w:r>
+      <w:r>
+        <w:rPr>
+          <w:rFonts w:ascii="Consolas" w:eastAsia="Times New Roman" w:hAnsi="Consolas" w:cs="Times New Roman"/>
+          <w:color w:val="202020"/>
+          <w:kern w:val="0"/>
+          <w:sz w:val="21"/>
+          <w:szCs w:val="21"/>
+          <w14:ligatures w14:val="none"/>
+        </w:rPr>
+        <w:t xml:space="preserve">) </w:t>
+      </w:r>
+      <w:r>
+        <w:rPr>
+          <w:rFonts w:ascii="Consolas" w:eastAsia="Times New Roman" w:hAnsi="Consolas" w:cs="Times New Roman"/>
+          <w:color w:val="CF222E"/>
+          <w:kern w:val="0"/>
+          <w:sz w:val="21"/>
+          <w:szCs w:val="21"/>
+          <w14:ligatures w14:val="none"/>
+        </w:rPr>
+        <w:t>=&gt;</w:t>
+      </w:r>
+      <w:r>
+        <w:rPr>
+          <w:rFonts w:ascii="Consolas" w:eastAsia="Times New Roman" w:hAnsi="Consolas" w:cs="Times New Roman"/>
+          <w:color w:val="202020"/>
+          <w:kern w:val="0"/>
+          <w:sz w:val="21"/>
+          <w:szCs w:val="21"/>
+          <w14:ligatures w14:val="none"/>
+        </w:rPr>
+        <w:t xml:space="preserve"> </w:t>
+      </w:r>
+      <w:r>
+        <w:rPr>
+          <w:rFonts w:ascii="Consolas" w:eastAsia="Times New Roman" w:hAnsi="Consolas" w:cs="Times New Roman"/>
+          <w:color w:val="1F2328"/>
+          <w:kern w:val="0"/>
+          <w:sz w:val="21"/>
+          <w:szCs w:val="21"/>
+          <w14:ligatures w14:val="none"/>
+        </w:rPr>
+        <w:t>{</w:t>
+      </w:r>
+    </w:p>
+    <w:p>
+      <w:pPr>
+        <w:shd w:val="clear" w:color="auto" w:fill="FFFFFF"/>
+        <w:spacing w:after="0" w:line="285" w:lineRule="atLeast"/>
+        <w:rPr>
+          <w:rFonts w:ascii="Consolas" w:eastAsia="Times New Roman" w:hAnsi="Consolas" w:cs="Times New Roman"/>
+          <w:color w:val="202020"/>
+          <w:kern w:val="0"/>
+          <w:sz w:val="21"/>
+          <w:szCs w:val="21"/>
+          <w14:ligatures w14:val="none"/>
+        </w:rPr>
+      </w:pPr>
+      <w:r>
+        <w:rPr>
+          <w:rFonts w:ascii="Consolas" w:eastAsia="Times New Roman" w:hAnsi="Consolas" w:cs="Times New Roman"/>
+          <w:color w:val="1F2328"/>
+          <w:kern w:val="0"/>
+          <w:sz w:val="21"/>
+          <w:szCs w:val="21"/>
+          <w14:ligatures w14:val="none"/>
+        </w:rPr>
+        <w:t xml:space="preserve">  </w:t>
+      </w:r>
+      <w:r>
+        <w:rPr>
+          <w:rFonts w:ascii="Consolas" w:eastAsia="Times New Roman" w:hAnsi="Consolas" w:cs="Times New Roman"/>
+          <w:color w:val="0550AE"/>
+          <w:kern w:val="0"/>
+          <w:sz w:val="21"/>
+          <w:szCs w:val="21"/>
+          <w14:ligatures w14:val="none"/>
+        </w:rPr>
+        <w:t>console</w:t>
+      </w:r>
+      <w:r>
+        <w:rPr>
+          <w:rFonts w:ascii="Consolas" w:eastAsia="Times New Roman" w:hAnsi="Consolas" w:cs="Times New Roman"/>
+          <w:color w:val="1F2328"/>
+          <w:kern w:val="0"/>
+          <w:sz w:val="21"/>
+          <w:szCs w:val="21"/>
+          <w14:ligatures w14:val="none"/>
+        </w:rPr>
+        <w:t>.</w:t>
+      </w:r>
+      <w:r>
+        <w:rPr>
+          <w:rFonts w:ascii="Consolas" w:eastAsia="Times New Roman" w:hAnsi="Consolas" w:cs="Times New Roman"/>
+          <w:color w:val="8250DF"/>
+          <w:kern w:val="0"/>
+          <w:sz w:val="21"/>
+          <w:szCs w:val="21"/>
+          <w14:ligatures w14:val="none"/>
+        </w:rPr>
+        <w:t>error</w:t>
+      </w:r>
+      <w:r>
+        <w:rPr>
+          <w:rFonts w:ascii="Consolas" w:eastAsia="Times New Roman" w:hAnsi="Consolas" w:cs="Times New Roman"/>
+          <w:color w:val="1F2328"/>
+          <w:kern w:val="0"/>
+          <w:sz w:val="21"/>
+          <w:szCs w:val="21"/>
+          <w14:ligatures w14:val="none"/>
+        </w:rPr>
+        <w:t>(</w:t>
+      </w:r>
+      <w:r>
+        <w:rPr>
+          <w:rFonts w:ascii="Consolas" w:eastAsia="Times New Roman" w:hAnsi="Consolas" w:cs="Times New Roman"/>
+          <w:color w:val="953800"/>
+          <w:kern w:val="0"/>
+          <w:sz w:val="21"/>
+          <w:szCs w:val="21"/>
+          <w14:ligatures w14:val="none"/>
+        </w:rPr>
+        <w:t>err</w:t>
+      </w:r>
+      <w:r>
+        <w:rPr>
+          <w:rFonts w:ascii="Consolas" w:eastAsia="Times New Roman" w:hAnsi="Consolas" w:cs="Times New Roman"/>
+          <w:color w:val="1F2328"/>
+          <w:kern w:val="0"/>
+          <w:sz w:val="21"/>
+          <w:szCs w:val="21"/>
+          <w14:ligatures w14:val="none"/>
+        </w:rPr>
+        <w:t>.stack)</w:t>
+      </w:r>
+    </w:p>
+    <w:p>
+      <w:pPr>
+        <w:shd w:val="clear" w:color="auto" w:fill="FFFFFF"/>
+        <w:spacing w:after="0" w:line="285" w:lineRule="atLeast"/>
+        <w:rPr>
+          <w:rFonts w:ascii="Consolas" w:eastAsia="Times New Roman" w:hAnsi="Consolas" w:cs="Times New Roman"/>
+          <w:color w:val="202020"/>
+          <w:kern w:val="0"/>
+          <w:sz w:val="21"/>
+          <w:szCs w:val="21"/>
+          <w14:ligatures w14:val="none"/>
+        </w:rPr>
+      </w:pPr>
+      <w:r>
+        <w:rPr>
+          <w:rFonts w:ascii="Consolas" w:eastAsia="Times New Roman" w:hAnsi="Consolas" w:cs="Times New Roman"/>
+          <w:color w:val="1F2328"/>
+          <w:kern w:val="0"/>
+          <w:sz w:val="21"/>
+          <w:szCs w:val="21"/>
+          <w14:ligatures w14:val="none"/>
+        </w:rPr>
+        <w:t xml:space="preserve">  </w:t>
+      </w:r>
+      <w:r>
+        <w:rPr>
+          <w:rFonts w:ascii="Consolas" w:eastAsia="Times New Roman" w:hAnsi="Consolas" w:cs="Times New Roman"/>
+          <w:color w:val="953800"/>
+          <w:kern w:val="0"/>
+          <w:sz w:val="21"/>
+          <w:szCs w:val="21"/>
+          <w14:ligatures w14:val="none"/>
+        </w:rPr>
+        <w:t>res</w:t>
+      </w:r>
+      <w:r>
+        <w:rPr>
+          <w:rFonts w:ascii="Consolas" w:eastAsia="Times New Roman" w:hAnsi="Consolas" w:cs="Times New Roman"/>
+          <w:color w:val="1F2328"/>
+          <w:kern w:val="0"/>
+          <w:sz w:val="21"/>
+          <w:szCs w:val="21"/>
+          <w14:ligatures w14:val="none"/>
+        </w:rPr>
+        <w:t>.</w:t>
+      </w:r>
+      <w:r>
+        <w:rPr>
+          <w:rFonts w:ascii="Consolas" w:eastAsia="Times New Roman" w:hAnsi="Consolas" w:cs="Times New Roman"/>
+          <w:color w:val="8250DF"/>
+          <w:kern w:val="0"/>
+          <w:sz w:val="21"/>
+          <w:szCs w:val="21"/>
+          <w14:ligatures w14:val="none"/>
+        </w:rPr>
+        <w:t>status</w:t>
+      </w:r>
+      <w:r>
+        <w:rPr>
+          <w:rFonts w:ascii="Consolas" w:eastAsia="Times New Roman" w:hAnsi="Consolas" w:cs="Times New Roman"/>
+          <w:color w:val="1F2328"/>
+          <w:kern w:val="0"/>
+          <w:sz w:val="21"/>
+          <w:szCs w:val="21"/>
+          <w14:ligatures w14:val="none"/>
+        </w:rPr>
+        <w:t>(</w:t>
+      </w:r>
+      <w:r>
+        <w:rPr>
+          <w:rFonts w:ascii="Consolas" w:eastAsia="Times New Roman" w:hAnsi="Consolas" w:cs="Times New Roman"/>
+          <w:color w:val="098658"/>
+          <w:kern w:val="0"/>
+          <w:sz w:val="21"/>
+          <w:szCs w:val="21"/>
+          <w14:ligatures w14:val="none"/>
+        </w:rPr>
+        <w:t>500</w:t>
+      </w:r>
+      <w:r>
+        <w:rPr>
+          <w:rFonts w:ascii="Consolas" w:eastAsia="Times New Roman" w:hAnsi="Consolas" w:cs="Times New Roman"/>
+          <w:color w:val="1F2328"/>
+          <w:kern w:val="0"/>
+          <w:sz w:val="21"/>
+          <w:szCs w:val="21"/>
+          <w14:ligatures w14:val="none"/>
+        </w:rPr>
+        <w:t>).</w:t>
+      </w:r>
+      <w:r>
+        <w:rPr>
+          <w:rFonts w:ascii="Consolas" w:eastAsia="Times New Roman" w:hAnsi="Consolas" w:cs="Times New Roman"/>
+          <w:color w:val="8250DF"/>
+          <w:kern w:val="0"/>
+          <w:sz w:val="21"/>
+          <w:szCs w:val="21"/>
+          <w14:ligatures w14:val="none"/>
+        </w:rPr>
+        <w:t>json</w:t>
+      </w:r>
+      <w:r>
+        <w:rPr>
+          <w:rFonts w:ascii="Consolas" w:eastAsia="Times New Roman" w:hAnsi="Consolas" w:cs="Times New Roman"/>
+          <w:color w:val="1F2328"/>
+          <w:kern w:val="0"/>
+          <w:sz w:val="21"/>
+          <w:szCs w:val="21"/>
+          <w14:ligatures w14:val="none"/>
+        </w:rPr>
+        <w:t xml:space="preserve">({ </w:t>
+      </w:r>
+    </w:p>
+    <w:p>
+      <w:pPr>
+        <w:shd w:val="clear" w:color="auto" w:fill="FFFFFF"/>
+        <w:spacing w:after="0" w:line="285" w:lineRule="atLeast"/>
+        <w:rPr>
+          <w:rFonts w:ascii="Consolas" w:eastAsia="Times New Roman" w:hAnsi="Consolas" w:cs="Times New Roman"/>
+          <w:color w:val="202020"/>
+          <w:kern w:val="0"/>
+          <w:sz w:val="21"/>
+          <w:szCs w:val="21"/>
+          <w14:ligatures w14:val="none"/>
+        </w:rPr>
+      </w:pPr>
+      <w:r>
+        <w:rPr>
+          <w:rFonts w:ascii="Consolas" w:eastAsia="Times New Roman" w:hAnsi="Consolas" w:cs="Times New Roman"/>
+          <w:color w:val="1F2328"/>
+          <w:kern w:val="0"/>
+          <w:sz w:val="21"/>
+          <w:szCs w:val="21"/>
+          <w14:ligatures w14:val="none"/>
+        </w:rPr>
+        <w:t>    success</w:t>
+      </w:r>
+      <w:r>
+        <w:rPr>
+          <w:rFonts w:ascii="Consolas" w:eastAsia="Times New Roman" w:hAnsi="Consolas" w:cs="Times New Roman"/>
+          <w:color w:val="001080"/>
+          <w:kern w:val="0"/>
+          <w:sz w:val="21"/>
+          <w:szCs w:val="21"/>
+          <w14:ligatures w14:val="none"/>
+        </w:rPr>
+        <w:t>:</w:t>
+      </w:r>
+      <w:r>
+        <w:rPr>
+          <w:rFonts w:ascii="Consolas" w:eastAsia="Times New Roman" w:hAnsi="Consolas" w:cs="Times New Roman"/>
+          <w:color w:val="1F2328"/>
+          <w:kern w:val="0"/>
+          <w:sz w:val="21"/>
+          <w:szCs w:val="21"/>
+          <w14:ligatures w14:val="none"/>
+        </w:rPr>
+        <w:t xml:space="preserve"> </w:t>
+      </w:r>
+      <w:r>
+        <w:rPr>
+          <w:rFonts w:ascii="Consolas" w:eastAsia="Times New Roman" w:hAnsi="Consolas" w:cs="Times New Roman"/>
+          <w:color w:val="0000FF"/>
+          <w:kern w:val="0"/>
+          <w:sz w:val="21"/>
+          <w:szCs w:val="21"/>
+          <w14:ligatures w14:val="none"/>
+        </w:rPr>
+        <w:t>false</w:t>
+      </w:r>
+      <w:r>
+        <w:rPr>
+          <w:rFonts w:ascii="Consolas" w:eastAsia="Times New Roman" w:hAnsi="Consolas" w:cs="Times New Roman"/>
+          <w:color w:val="1F2328"/>
+          <w:kern w:val="0"/>
+          <w:sz w:val="21"/>
+          <w:szCs w:val="21"/>
+          <w14:ligatures w14:val="none"/>
+        </w:rPr>
+        <w:t xml:space="preserve">, </w:t>
+      </w:r>
+    </w:p>
+    <w:p>
+      <w:pPr>
+        <w:shd w:val="clear" w:color="auto" w:fill="FFFFFF"/>
+        <w:spacing w:after="0" w:line="285" w:lineRule="atLeast"/>
+        <w:rPr>
+          <w:rFonts w:ascii="Consolas" w:eastAsia="Times New Roman" w:hAnsi="Consolas" w:cs="Times New Roman"/>
+          <w:color w:val="202020"/>
+          <w:kern w:val="0"/>
+          <w:sz w:val="21"/>
+          <w:szCs w:val="21"/>
+          <w14:ligatures w14:val="none"/>
+        </w:rPr>
+      </w:pPr>
+      <w:r>
+        <w:rPr>
+          <w:rFonts w:ascii="Consolas" w:eastAsia="Times New Roman" w:hAnsi="Consolas" w:cs="Times New Roman"/>
+          <w:color w:val="1F2328"/>
+          <w:kern w:val="0"/>
+          <w:sz w:val="21"/>
+          <w:szCs w:val="21"/>
+          <w14:ligatures w14:val="none"/>
+        </w:rPr>
+        <w:t>    message</w:t>
+      </w:r>
+      <w:r>
+        <w:rPr>
+          <w:rFonts w:ascii="Consolas" w:eastAsia="Times New Roman" w:hAnsi="Consolas" w:cs="Times New Roman"/>
+          <w:color w:val="001080"/>
+          <w:kern w:val="0"/>
+          <w:sz w:val="21"/>
+          <w:szCs w:val="21"/>
+          <w14:ligatures w14:val="none"/>
+        </w:rPr>
+        <w:t>:</w:t>
+      </w:r>
+      <w:r>
+        <w:rPr>
+          <w:rFonts w:ascii="Consolas" w:eastAsia="Times New Roman" w:hAnsi="Consolas" w:cs="Times New Roman"/>
+          <w:color w:val="1F2328"/>
+          <w:kern w:val="0"/>
+          <w:sz w:val="21"/>
+          <w:szCs w:val="21"/>
+          <w14:ligatures w14:val="none"/>
+        </w:rPr>
+        <w:t xml:space="preserve"> </w:t>
+      </w:r>
+      <w:r>
+        <w:rPr>
+          <w:rFonts w:ascii="Consolas" w:eastAsia="Times New Roman" w:hAnsi="Consolas" w:cs="Times New Roman"/>
+          <w:color w:val="953800"/>
+          <w:kern w:val="0"/>
+          <w:sz w:val="21"/>
+          <w:szCs w:val="21"/>
+          <w14:ligatures w14:val="none"/>
+        </w:rPr>
+        <w:t>req</w:t>
+      </w:r>
+      <w:r>
+        <w:rPr>
+          <w:rFonts w:ascii="Consolas" w:eastAsia="Times New Roman" w:hAnsi="Consolas" w:cs="Times New Roman"/>
+          <w:color w:val="1F2328"/>
+          <w:kern w:val="0"/>
+          <w:sz w:val="21"/>
+          <w:szCs w:val="21"/>
+          <w14:ligatures w14:val="none"/>
+        </w:rPr>
+        <w:t>.</w:t>
+      </w:r>
+      <w:r>
+        <w:rPr>
+          <w:rFonts w:ascii="Consolas" w:eastAsia="Times New Roman" w:hAnsi="Consolas" w:cs="Times New Roman"/>
+          <w:color w:val="8250DF"/>
+          <w:kern w:val="0"/>
+          <w:sz w:val="21"/>
+          <w:szCs w:val="21"/>
+          <w14:ligatures w14:val="none"/>
+        </w:rPr>
+        <w:t>__</w:t>
+      </w:r>
+      <w:r>
+        <w:rPr>
+          <w:rFonts w:ascii="Consolas" w:eastAsia="Times New Roman" w:hAnsi="Consolas" w:cs="Times New Roman"/>
+          <w:color w:val="1F2328"/>
+          <w:kern w:val="0"/>
+          <w:sz w:val="21"/>
+          <w:szCs w:val="21"/>
+          <w14:ligatures w14:val="none"/>
+        </w:rPr>
+        <w:t>(</w:t>
+      </w:r>
+      <w:r>
+        <w:rPr>
+          <w:rFonts w:ascii="Consolas" w:eastAsia="Times New Roman" w:hAnsi="Consolas" w:cs="Times New Roman"/>
+          <w:color w:val="0A3069"/>
+          <w:kern w:val="0"/>
+          <w:sz w:val="21"/>
+          <w:szCs w:val="21"/>
+          <w14:ligatures w14:val="none"/>
+        </w:rPr>
+        <w:t>'Internal server error'</w:t>
+      </w:r>
+      <w:r>
+        <w:rPr>
+          <w:rFonts w:ascii="Consolas" w:eastAsia="Times New Roman" w:hAnsi="Consolas" w:cs="Times New Roman"/>
+          <w:color w:val="1F2328"/>
+          <w:kern w:val="0"/>
+          <w:sz w:val="21"/>
+          <w:szCs w:val="21"/>
+          <w14:ligatures w14:val="none"/>
+        </w:rPr>
+        <w:t xml:space="preserve">) </w:t>
+      </w:r>
+    </w:p>
+    <w:p>
+      <w:pPr>
+        <w:shd w:val="clear" w:color="auto" w:fill="FFFFFF"/>
+        <w:spacing w:after="0" w:line="285" w:lineRule="atLeast"/>
+        <w:rPr>
+          <w:rFonts w:ascii="Consolas" w:eastAsia="Times New Roman" w:hAnsi="Consolas" w:cs="Times New Roman"/>
+          <w:color w:val="202020"/>
+          <w:kern w:val="0"/>
+          <w:sz w:val="21"/>
+          <w:szCs w:val="21"/>
+          <w14:ligatures w14:val="none"/>
+        </w:rPr>
+      </w:pPr>
+      <w:r>
+        <w:rPr>
+          <w:rFonts w:ascii="Consolas" w:eastAsia="Times New Roman" w:hAnsi="Consolas" w:cs="Times New Roman"/>
+          <w:color w:val="1F2328"/>
+          <w:kern w:val="0"/>
+          <w:sz w:val="21"/>
+          <w:szCs w:val="21"/>
+          <w14:ligatures w14:val="none"/>
+        </w:rPr>
+        <w:t>  })</w:t>
+      </w:r>
+    </w:p>
+    <w:p>
+      <w:pPr>
+        <w:shd w:val="clear" w:color="auto" w:fill="FFFFFF"/>
+        <w:spacing w:after="0" w:line="285" w:lineRule="atLeast"/>
+        <w:rPr>
+          <w:rFonts w:ascii="Consolas" w:eastAsia="Times New Roman" w:hAnsi="Consolas" w:cs="Times New Roman"/>
+          <w:color w:val="202020"/>
+          <w:kern w:val="0"/>
+          <w:sz w:val="21"/>
+          <w:szCs w:val="21"/>
+          <w14:ligatures w14:val="none"/>
+        </w:rPr>
+      </w:pPr>
+      <w:r>
+        <w:rPr>
+          <w:rFonts w:ascii="Consolas" w:eastAsia="Times New Roman" w:hAnsi="Consolas" w:cs="Times New Roman"/>
+          <w:color w:val="1F2328"/>
+          <w:kern w:val="0"/>
+          <w:sz w:val="21"/>
+          <w:szCs w:val="21"/>
+          <w14:ligatures w14:val="none"/>
+        </w:rPr>
+        <w:t>}</w:t>
+      </w:r>
+      <w:r>
+        <w:rPr>
+          <w:rFonts w:ascii="Consolas" w:eastAsia="Times New Roman" w:hAnsi="Consolas" w:cs="Times New Roman"/>
+          <w:color w:val="202020"/>
+          <w:kern w:val="0"/>
+          <w:sz w:val="21"/>
+          <w:szCs w:val="21"/>
+          <w14:ligatures w14:val="none"/>
+        </w:rPr>
+        <w:t>)</w:t>
+      </w:r>
+    </w:p>
+    <w:p>
+      <w:pPr>
+        <w:ind w:left="1440" w:firstLine="720"/>
+        <w:rPr>
+          <w:rFonts w:ascii="Sakkal Majalla" w:hAnsi="Sakkal Majalla" w:cs="Sakkal Majalla"/>
+        </w:rPr>
+      </w:pPr>
+      <w:r>
+        <w:rPr>
+          <w:rFonts w:ascii="Sakkal Majalla" w:hAnsi="Sakkal Majalla" w:cs="Sakkal Majalla"/>
+        </w:rPr>
+        <w:t>================================================</w:t>
+      </w:r>
+    </w:p>
+    <w:p>
+      <w:pPr>
+        <w:shd w:val="clear" w:color="auto" w:fill="FFFFFF"/>
+        <w:spacing w:after="0" w:line="285" w:lineRule="atLeast"/>
+        <w:rPr>
+          <w:rFonts w:ascii="Sakkal Majalla" w:eastAsia="Times New Roman" w:hAnsi="Sakkal Majalla" w:cs="Sakkal Majalla"/>
           <w:color w:val="202020"/>
           <w:kern w:val="0"/>
           <w14:ligatures w14:val="none"/>

</xml_diff>